<commit_message>
Add global CSS styling
</commit_message>
<xml_diff>
--- a/tax_my_app_research_doc.docx
+++ b/tax_my_app_research_doc.docx
@@ -1,6 +1,6 @@
 
 <file path=word/document.xml><?xml version="1.0" encoding="utf-8"?>
-<w:document xmlns:wpc="http://schemas.microsoft.com/office/word/2010/wordprocessingCanvas" xmlns:cx="http://schemas.microsoft.com/office/drawing/2014/chartex" xmlns:cx1="http://schemas.microsoft.com/office/drawing/2015/9/8/chartex" xmlns:cx2="http://schemas.microsoft.com/office/drawing/2015/10/21/chartex" xmlns:cx3="http://schemas.microsoft.com/office/drawing/2016/5/9/chartex" xmlns:cx4="http://schemas.microsoft.com/office/drawing/2016/5/10/chartex" xmlns:cx5="http://schemas.microsoft.com/office/drawing/2016/5/11/chartex" xmlns:cx6="http://schemas.microsoft.com/office/drawing/2016/5/12/chartex" xmlns:cx7="http://schemas.microsoft.com/office/drawing/2016/5/13/chartex" xmlns:cx8="http://schemas.microsoft.com/office/drawing/2016/5/14/chartex" xmlns:mc="http://schemas.openxmlformats.org/markup-compatibility/2006" xmlns:aink="http://schemas.microsoft.com/office/drawing/2016/ink" xmlns:am3d="http://schemas.microsoft.com/office/drawing/2017/model3d" xmlns:o="urn:schemas-microsoft-com:office:office" xmlns:oel="http://schemas.microsoft.com/office/2019/extlst" xmlns:r="http://schemas.openxmlformats.org/officeDocument/2006/relationships" xmlns:m="http://schemas.openxmlformats.org/officeDocument/2006/math" xmlns:v="urn:schemas-microsoft-com:vml" xmlns:wp14="http://schemas.microsoft.com/office/word/2010/wordprocessingDrawing" xmlns:wp="http://schemas.openxmlformats.org/drawingml/2006/wordprocessingDrawing" xmlns:w10="urn:schemas-microsoft-com:office:word" xmlns:w="http://schemas.openxmlformats.org/wordprocessingml/2006/main" xmlns:w14="http://schemas.microsoft.com/office/word/2010/wordml" xmlns:w15="http://schemas.microsoft.com/office/word/2012/wordml" xmlns:w16cex="http://schemas.microsoft.com/office/word/2018/wordml/cex" xmlns:w16cid="http://schemas.microsoft.com/office/word/2016/wordml/cid" xmlns:w16="http://schemas.microsoft.com/office/word/2018/wordml" xmlns:w16du="http://schemas.microsoft.com/office/word/2023/wordml/word16du" xmlns:w16sdtdh="http://schemas.microsoft.com/office/word/2020/wordml/sdtdatahash" xmlns:w16sdtfl="http://schemas.microsoft.com/office/word/2024/wordml/sdtformatlock" xmlns:w16se="http://schemas.microsoft.com/office/word/2015/wordml/symex" xmlns:wpg="http://schemas.microsoft.com/office/word/2010/wordprocessingGroup" xmlns:wpi="http://schemas.microsoft.com/office/word/2010/wordprocessingInk" xmlns:wne="http://schemas.microsoft.com/office/word/2006/wordml" xmlns:wps="http://schemas.microsoft.com/office/word/2010/wordprocessingShape" mc:Ignorable="w14 w15 w16se w16cid w16 w16cex w16sdtdh w16sdtfl w16du wp14">
+<w:document xmlns:wpc="http://schemas.microsoft.com/office/word/2010/wordprocessingCanvas" xmlns:cx="http://schemas.microsoft.com/office/drawing/2014/chartex" xmlns:cx1="http://schemas.microsoft.com/office/drawing/2015/9/8/chartex" xmlns:cx2="http://schemas.microsoft.com/office/drawing/2015/10/21/chartex" xmlns:cx3="http://schemas.microsoft.com/office/drawing/2016/5/9/chartex" xmlns:cx4="http://schemas.microsoft.com/office/drawing/2016/5/10/chartex" xmlns:cx5="http://schemas.microsoft.com/office/drawing/2016/5/11/chartex" xmlns:cx6="http://schemas.microsoft.com/office/drawing/2016/5/12/chartex" xmlns:cx7="http://schemas.microsoft.com/office/drawing/2016/5/13/chartex" xmlns:cx8="http://schemas.microsoft.com/office/drawing/2016/5/14/chartex" xmlns:mc="http://schemas.openxmlformats.org/markup-compatibility/2006" xmlns:aink="http://schemas.microsoft.com/office/drawing/2016/ink" xmlns:am3d="http://schemas.microsoft.com/office/drawing/2017/model3d" xmlns:o="urn:schemas-microsoft-com:office:office" xmlns:oel="http://schemas.microsoft.com/office/2019/extlst" xmlns:r="http://schemas.openxmlformats.org/officeDocument/2006/relationships" xmlns:m="http://schemas.openxmlformats.org/officeDocument/2006/math" xmlns:v="urn:schemas-microsoft-com:vml" xmlns:wp14="http://schemas.microsoft.com/office/word/2010/wordprocessingDrawing" xmlns:wp="http://schemas.openxmlformats.org/drawingml/2006/wordprocessingDrawing" xmlns:w10="urn:schemas-microsoft-com:office:word" xmlns:w="http://schemas.openxmlformats.org/wordprocessingml/2006/main" xmlns:w14="http://schemas.microsoft.com/office/word/2010/wordml" xmlns:w15="http://schemas.microsoft.com/office/word/2012/wordml" xmlns:w16cei="http://schemas.microsoft.com/office/word/2026/wordml/cei" xmlns:w16cex="http://schemas.microsoft.com/office/word/2018/wordml/cex" xmlns:w16cid="http://schemas.microsoft.com/office/word/2016/wordml/cid" xmlns:w16="http://schemas.microsoft.com/office/word/2018/wordml" xmlns:w16du="http://schemas.microsoft.com/office/word/2023/wordml/word16du" xmlns:w16sdtdh="http://schemas.microsoft.com/office/word/2020/wordml/sdtdatahash" xmlns:w16sdtfl="http://schemas.microsoft.com/office/word/2024/wordml/sdtformatlock" xmlns:w16se="http://schemas.microsoft.com/office/word/2015/wordml/symex" xmlns:wpg="http://schemas.microsoft.com/office/word/2010/wordprocessingGroup" xmlns:wpi="http://schemas.microsoft.com/office/word/2010/wordprocessingInk" xmlns:wne="http://schemas.microsoft.com/office/word/2006/wordml" xmlns:wps="http://schemas.microsoft.com/office/word/2010/wordprocessingShape" mc:Ignorable="w14 w15 w16se w16cid w16 w16cex w16sdtdh w16sdtfl w16du wp14">
   <w:body>
     <w:p>
       <w:r>
@@ -1568,10 +1568,7 @@
         <w:t>under sdn bhd to travel for client meeting, app must enforce strict capping LHDN rules:</w:t>
       </w:r>
       <w:r>
-        <w:t xml:space="preserve"> </w:t>
-      </w:r>
-      <w:r>
-        <w:t>Capital allowances on passenger cars are restricted to a maximum lifecycle cost of RM 50,000 (or RM 100,000 if the vehicle is brand new and total cost doesn't exceed RM 150,000).</w:t>
+        <w:t xml:space="preserve"> Capital allowances on passenger cars are restricted to a maximum lifecycle cost of RM 50,000 (or RM 100,000 if the vehicle is brand new and total cost doesn't exceed RM 150,000).</w:t>
       </w:r>
     </w:p>
     <w:p>
@@ -2748,7 +2745,7 @@
     <w:p>
       <w:r>
         <w:pict w14:anchorId="0C41B231">
-          <v:rect id="_x0000_i1043" style="width:0;height:1.5pt" o:hralign="center" o:hrstd="t" o:hr="t" fillcolor="#a0a0a0" stroked="f"/>
+          <v:rect id="_x0000_i1025" style="width:0;height:1.5pt" o:hralign="center" o:hrstd="t" o:hr="t" fillcolor="#a0a0a0" stroked="f"/>
         </w:pict>
       </w:r>
     </w:p>
@@ -2859,7 +2856,7 @@
     <w:p>
       <w:r>
         <w:pict w14:anchorId="4F5DB1FB">
-          <v:rect id="_x0000_i1044" style="width:0;height:1.5pt" o:hralign="center" o:hrstd="t" o:hr="t" fillcolor="#a0a0a0" stroked="f"/>
+          <v:rect id="_x0000_i1026" style="width:0;height:1.5pt" o:hralign="center" o:hrstd="t" o:hr="t" fillcolor="#a0a0a0" stroked="f"/>
         </w:pict>
       </w:r>
     </w:p>
@@ -2947,7 +2944,7 @@
     <w:p>
       <w:r>
         <w:pict w14:anchorId="5881BC27">
-          <v:rect id="_x0000_i1045" style="width:0;height:1.5pt" o:hralign="center" o:hrstd="t" o:hr="t" fillcolor="#a0a0a0" stroked="f"/>
+          <v:rect id="_x0000_i1027" style="width:0;height:1.5pt" o:hralign="center" o:hrstd="t" o:hr="t" fillcolor="#a0a0a0" stroked="f"/>
         </w:pict>
       </w:r>
     </w:p>
@@ -3105,7 +3102,7 @@
     <w:p>
       <w:r>
         <w:pict w14:anchorId="5540E717">
-          <v:rect id="_x0000_i1055" style="width:0;height:1.5pt" o:hralign="center" o:hrstd="t" o:hr="t" fillcolor="#a0a0a0" stroked="f"/>
+          <v:rect id="_x0000_i1028" style="width:0;height:1.5pt" o:hralign="center" o:hrstd="t" o:hr="t" fillcolor="#a0a0a0" stroked="f"/>
         </w:pict>
       </w:r>
     </w:p>
@@ -3710,6 +3707,867 @@
         <w:t>Trigger CP204A Revision Alert (6th, 9th, or 11th Month)</w:t>
       </w:r>
     </w:p>
+    <w:p>
+      <w:pPr>
+        <w:ind w:left="5760"/>
+      </w:pPr>
+    </w:p>
+    <w:p>
+      <w:pPr>
+        <w:ind w:left="5760"/>
+      </w:pPr>
+    </w:p>
+    <w:p>
+      <w:pPr>
+        <w:ind w:left="5760"/>
+      </w:pPr>
+    </w:p>
+    <w:p>
+      <w:pPr>
+        <w:ind w:left="5760"/>
+      </w:pPr>
+    </w:p>
+    <w:p>
+      <w:pPr>
+        <w:ind w:left="5760"/>
+      </w:pPr>
+    </w:p>
+    <w:p>
+      <w:pPr>
+        <w:ind w:left="5760"/>
+      </w:pPr>
+    </w:p>
+    <w:p>
+      <w:pPr>
+        <w:ind w:left="5760"/>
+      </w:pPr>
+    </w:p>
+    <w:p>
+      <w:pPr>
+        <w:ind w:left="5760"/>
+      </w:pPr>
+    </w:p>
+    <w:p>
+      <w:pPr>
+        <w:ind w:left="5760"/>
+      </w:pPr>
+    </w:p>
+    <w:p/>
+    <w:p>
+      <w:r>
+        <w:rPr>
+          <w:noProof/>
+        </w:rPr>
+        <mc:AlternateContent>
+          <mc:Choice Requires="wps">
+            <w:drawing>
+              <wp:anchor distT="0" distB="0" distL="114300" distR="114300" simplePos="0" relativeHeight="251659264" behindDoc="0" locked="0" layoutInCell="1" allowOverlap="1" wp14:anchorId="0643C46C" wp14:editId="70D324B8">
+                <wp:simplePos x="0" y="0"/>
+                <wp:positionH relativeFrom="column">
+                  <wp:posOffset>369116</wp:posOffset>
+                </wp:positionH>
+                <wp:positionV relativeFrom="paragraph">
+                  <wp:posOffset>377505</wp:posOffset>
+                </wp:positionV>
+                <wp:extent cx="0" cy="427838"/>
+                <wp:effectExtent l="76200" t="0" r="57150" b="48895"/>
+                <wp:wrapNone/>
+                <wp:docPr id="57188849" name="Straight Arrow Connector 1"/>
+                <wp:cNvGraphicFramePr/>
+                <a:graphic xmlns:a="http://schemas.openxmlformats.org/drawingml/2006/main">
+                  <a:graphicData uri="http://schemas.microsoft.com/office/word/2010/wordprocessingShape">
+                    <wps:wsp>
+                      <wps:cNvCnPr/>
+                      <wps:spPr>
+                        <a:xfrm>
+                          <a:off x="0" y="0"/>
+                          <a:ext cx="0" cy="427838"/>
+                        </a:xfrm>
+                        <a:prstGeom prst="straightConnector1">
+                          <a:avLst/>
+                        </a:prstGeom>
+                        <a:ln>
+                          <a:tailEnd type="triangle"/>
+                        </a:ln>
+                      </wps:spPr>
+                      <wps:style>
+                        <a:lnRef idx="1">
+                          <a:schemeClr val="accent1"/>
+                        </a:lnRef>
+                        <a:fillRef idx="0">
+                          <a:schemeClr val="accent1"/>
+                        </a:fillRef>
+                        <a:effectRef idx="0">
+                          <a:schemeClr val="accent1"/>
+                        </a:effectRef>
+                        <a:fontRef idx="minor">
+                          <a:schemeClr val="tx1"/>
+                        </a:fontRef>
+                      </wps:style>
+                      <wps:bodyPr/>
+                    </wps:wsp>
+                  </a:graphicData>
+                </a:graphic>
+              </wp:anchor>
+            </w:drawing>
+          </mc:Choice>
+          <mc:Fallback>
+            <w:pict>
+              <v:shapetype w14:anchorId="0E2B9146" id="_x0000_t32" coordsize="21600,21600" o:spt="32" o:oned="t" path="m,l21600,21600e" filled="f">
+                <v:path arrowok="t" fillok="f" o:connecttype="none"/>
+                <o:lock v:ext="edit" shapetype="t"/>
+              </v:shapetype>
+              <v:shape id="Straight Arrow Connector 1" o:spid="_x0000_s1026" type="#_x0000_t32" style="position:absolute;margin-left:29.05pt;margin-top:29.7pt;width:0;height:33.7pt;z-index:251659264;visibility:visible;mso-wrap-style:square;mso-wrap-distance-left:9pt;mso-wrap-distance-top:0;mso-wrap-distance-right:9pt;mso-wrap-distance-bottom:0;mso-position-horizontal:absolute;mso-position-horizontal-relative:text;mso-position-vertical:absolute;mso-position-vertical-relative:text" o:gfxdata="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" strokecolor="#156082 [3204]" strokeweight=".5pt">
+                <v:stroke endarrow="block" joinstyle="miter"/>
+              </v:shape>
+            </w:pict>
+          </mc:Fallback>
+        </mc:AlternateContent>
+      </w:r>
+      <w:r>
+        <w:t xml:space="preserve">Homepage </w:t>
+      </w:r>
+    </w:p>
+    <w:p/>
+    <w:p/>
+    <w:p>
+      <w:r>
+        <w:t xml:space="preserve">       Login</w:t>
+      </w:r>
+    </w:p>
+    <w:p>
+      <w:r>
+        <w:rPr>
+          <w:noProof/>
+        </w:rPr>
+        <mc:AlternateContent>
+          <mc:Choice Requires="wps">
+            <w:drawing>
+              <wp:anchor distT="0" distB="0" distL="114300" distR="114300" simplePos="0" relativeHeight="251660288" behindDoc="0" locked="0" layoutInCell="1" allowOverlap="1" wp14:anchorId="6F349D9A" wp14:editId="508F1967">
+                <wp:simplePos x="0" y="0"/>
+                <wp:positionH relativeFrom="column">
+                  <wp:posOffset>343949</wp:posOffset>
+                </wp:positionH>
+                <wp:positionV relativeFrom="paragraph">
+                  <wp:posOffset>8914</wp:posOffset>
+                </wp:positionV>
+                <wp:extent cx="0" cy="427838"/>
+                <wp:effectExtent l="76200" t="0" r="57150" b="48895"/>
+                <wp:wrapNone/>
+                <wp:docPr id="1013239350" name="Straight Arrow Connector 1"/>
+                <wp:cNvGraphicFramePr/>
+                <a:graphic xmlns:a="http://schemas.openxmlformats.org/drawingml/2006/main">
+                  <a:graphicData uri="http://schemas.microsoft.com/office/word/2010/wordprocessingShape">
+                    <wps:wsp>
+                      <wps:cNvCnPr/>
+                      <wps:spPr>
+                        <a:xfrm>
+                          <a:off x="0" y="0"/>
+                          <a:ext cx="0" cy="427838"/>
+                        </a:xfrm>
+                        <a:prstGeom prst="straightConnector1">
+                          <a:avLst/>
+                        </a:prstGeom>
+                        <a:ln>
+                          <a:tailEnd type="triangle"/>
+                        </a:ln>
+                      </wps:spPr>
+                      <wps:style>
+                        <a:lnRef idx="1">
+                          <a:schemeClr val="accent1"/>
+                        </a:lnRef>
+                        <a:fillRef idx="0">
+                          <a:schemeClr val="accent1"/>
+                        </a:fillRef>
+                        <a:effectRef idx="0">
+                          <a:schemeClr val="accent1"/>
+                        </a:effectRef>
+                        <a:fontRef idx="minor">
+                          <a:schemeClr val="tx1"/>
+                        </a:fontRef>
+                      </wps:style>
+                      <wps:bodyPr/>
+                    </wps:wsp>
+                  </a:graphicData>
+                </a:graphic>
+              </wp:anchor>
+            </w:drawing>
+          </mc:Choice>
+          <mc:Fallback>
+            <w:pict>
+              <v:shape w14:anchorId="1D88E873" id="Straight Arrow Connector 1" o:spid="_x0000_s1026" type="#_x0000_t32" style="position:absolute;margin-left:27.1pt;margin-top:.7pt;width:0;height:33.7pt;z-index:251660288;visibility:visible;mso-wrap-style:square;mso-wrap-distance-left:9pt;mso-wrap-distance-top:0;mso-wrap-distance-right:9pt;mso-wrap-distance-bottom:0;mso-position-horizontal:absolute;mso-position-horizontal-relative:text;mso-position-vertical:absolute;mso-position-vertical-relative:text" o:gfxdata="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" strokecolor="#156082 [3204]" strokeweight=".5pt">
+                <v:stroke endarrow="block" joinstyle="miter"/>
+              </v:shape>
+            </w:pict>
+          </mc:Fallback>
+        </mc:AlternateContent>
+      </w:r>
+    </w:p>
+    <w:p/>
+    <w:p>
+      <w:r>
+        <w:t>Dashboard</w:t>
+      </w:r>
+    </w:p>
+    <w:p>
+      <w:r>
+        <w:rPr>
+          <w:noProof/>
+        </w:rPr>
+        <mc:AlternateContent>
+          <mc:Choice Requires="wps">
+            <w:drawing>
+              <wp:anchor distT="0" distB="0" distL="114300" distR="114300" simplePos="0" relativeHeight="251663360" behindDoc="0" locked="0" layoutInCell="1" allowOverlap="1" wp14:anchorId="1CCE5305" wp14:editId="3253AF0C">
+                <wp:simplePos x="0" y="0"/>
+                <wp:positionH relativeFrom="column">
+                  <wp:posOffset>931178</wp:posOffset>
+                </wp:positionH>
+                <wp:positionV relativeFrom="paragraph">
+                  <wp:posOffset>5354</wp:posOffset>
+                </wp:positionV>
+                <wp:extent cx="1837189" cy="679508"/>
+                <wp:effectExtent l="0" t="0" r="67945" b="63500"/>
+                <wp:wrapNone/>
+                <wp:docPr id="338463328" name="Straight Arrow Connector 1"/>
+                <wp:cNvGraphicFramePr/>
+                <a:graphic xmlns:a="http://schemas.openxmlformats.org/drawingml/2006/main">
+                  <a:graphicData uri="http://schemas.microsoft.com/office/word/2010/wordprocessingShape">
+                    <wps:wsp>
+                      <wps:cNvCnPr/>
+                      <wps:spPr>
+                        <a:xfrm>
+                          <a:off x="0" y="0"/>
+                          <a:ext cx="1837189" cy="679508"/>
+                        </a:xfrm>
+                        <a:prstGeom prst="straightConnector1">
+                          <a:avLst/>
+                        </a:prstGeom>
+                        <a:ln>
+                          <a:tailEnd type="triangle"/>
+                        </a:ln>
+                      </wps:spPr>
+                      <wps:style>
+                        <a:lnRef idx="1">
+                          <a:schemeClr val="accent1"/>
+                        </a:lnRef>
+                        <a:fillRef idx="0">
+                          <a:schemeClr val="accent1"/>
+                        </a:fillRef>
+                        <a:effectRef idx="0">
+                          <a:schemeClr val="accent1"/>
+                        </a:effectRef>
+                        <a:fontRef idx="minor">
+                          <a:schemeClr val="tx1"/>
+                        </a:fontRef>
+                      </wps:style>
+                      <wps:bodyPr/>
+                    </wps:wsp>
+                  </a:graphicData>
+                </a:graphic>
+                <wp14:sizeRelH relativeFrom="margin">
+                  <wp14:pctWidth>0</wp14:pctWidth>
+                </wp14:sizeRelH>
+                <wp14:sizeRelV relativeFrom="margin">
+                  <wp14:pctHeight>0</wp14:pctHeight>
+                </wp14:sizeRelV>
+              </wp:anchor>
+            </w:drawing>
+          </mc:Choice>
+          <mc:Fallback>
+            <w:pict>
+              <v:shape w14:anchorId="2DF4C30E" id="Straight Arrow Connector 1" o:spid="_x0000_s1026" type="#_x0000_t32" style="position:absolute;margin-left:73.3pt;margin-top:.4pt;width:144.65pt;height:53.5pt;z-index:251663360;visibility:visible;mso-wrap-style:square;mso-width-percent:0;mso-height-percent:0;mso-wrap-distance-left:9pt;mso-wrap-distance-top:0;mso-wrap-distance-right:9pt;mso-wrap-distance-bottom:0;mso-position-horizontal:absolute;mso-position-horizontal-relative:text;mso-position-vertical:absolute;mso-position-vertical-relative:text;mso-width-percent:0;mso-height-percent:0;mso-width-relative:margin;mso-height-relative:margin" o:gfxdata="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" strokecolor="#156082 [3204]" strokeweight=".5pt">
+                <v:stroke endarrow="block" joinstyle="miter"/>
+              </v:shape>
+            </w:pict>
+          </mc:Fallback>
+        </mc:AlternateContent>
+      </w:r>
+      <w:r>
+        <w:rPr>
+          <w:noProof/>
+        </w:rPr>
+        <mc:AlternateContent>
+          <mc:Choice Requires="wps">
+            <w:drawing>
+              <wp:anchor distT="0" distB="0" distL="114300" distR="114300" simplePos="0" relativeHeight="251662336" behindDoc="0" locked="0" layoutInCell="1" allowOverlap="1" wp14:anchorId="4F6F3D18" wp14:editId="7987A479">
+                <wp:simplePos x="0" y="0"/>
+                <wp:positionH relativeFrom="column">
+                  <wp:posOffset>629349</wp:posOffset>
+                </wp:positionH>
+                <wp:positionV relativeFrom="paragraph">
+                  <wp:posOffset>114101</wp:posOffset>
+                </wp:positionV>
+                <wp:extent cx="720754" cy="545284"/>
+                <wp:effectExtent l="0" t="0" r="79375" b="64770"/>
+                <wp:wrapNone/>
+                <wp:docPr id="1563724670" name="Straight Arrow Connector 1"/>
+                <wp:cNvGraphicFramePr/>
+                <a:graphic xmlns:a="http://schemas.openxmlformats.org/drawingml/2006/main">
+                  <a:graphicData uri="http://schemas.microsoft.com/office/word/2010/wordprocessingShape">
+                    <wps:wsp>
+                      <wps:cNvCnPr/>
+                      <wps:spPr>
+                        <a:xfrm>
+                          <a:off x="0" y="0"/>
+                          <a:ext cx="720754" cy="545284"/>
+                        </a:xfrm>
+                        <a:prstGeom prst="straightConnector1">
+                          <a:avLst/>
+                        </a:prstGeom>
+                        <a:ln>
+                          <a:tailEnd type="triangle"/>
+                        </a:ln>
+                      </wps:spPr>
+                      <wps:style>
+                        <a:lnRef idx="1">
+                          <a:schemeClr val="accent1"/>
+                        </a:lnRef>
+                        <a:fillRef idx="0">
+                          <a:schemeClr val="accent1"/>
+                        </a:fillRef>
+                        <a:effectRef idx="0">
+                          <a:schemeClr val="accent1"/>
+                        </a:effectRef>
+                        <a:fontRef idx="minor">
+                          <a:schemeClr val="tx1"/>
+                        </a:fontRef>
+                      </wps:style>
+                      <wps:bodyPr/>
+                    </wps:wsp>
+                  </a:graphicData>
+                </a:graphic>
+                <wp14:sizeRelH relativeFrom="margin">
+                  <wp14:pctWidth>0</wp14:pctWidth>
+                </wp14:sizeRelH>
+                <wp14:sizeRelV relativeFrom="margin">
+                  <wp14:pctHeight>0</wp14:pctHeight>
+                </wp14:sizeRelV>
+              </wp:anchor>
+            </w:drawing>
+          </mc:Choice>
+          <mc:Fallback>
+            <w:pict>
+              <v:shape w14:anchorId="77B43DE0" id="Straight Arrow Connector 1" o:spid="_x0000_s1026" type="#_x0000_t32" style="position:absolute;margin-left:49.55pt;margin-top:9pt;width:56.75pt;height:42.95pt;z-index:251662336;visibility:visible;mso-wrap-style:square;mso-width-percent:0;mso-height-percent:0;mso-wrap-distance-left:9pt;mso-wrap-distance-top:0;mso-wrap-distance-right:9pt;mso-wrap-distance-bottom:0;mso-position-horizontal:absolute;mso-position-horizontal-relative:text;mso-position-vertical:absolute;mso-position-vertical-relative:text;mso-width-percent:0;mso-height-percent:0;mso-width-relative:margin;mso-height-relative:margin" o:gfxdata="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" strokecolor="#156082 [3204]" strokeweight=".5pt">
+                <v:stroke endarrow="block" joinstyle="miter"/>
+              </v:shape>
+            </w:pict>
+          </mc:Fallback>
+        </mc:AlternateContent>
+      </w:r>
+      <w:r>
+        <w:rPr>
+          <w:noProof/>
+        </w:rPr>
+        <mc:AlternateContent>
+          <mc:Choice Requires="wps">
+            <w:drawing>
+              <wp:anchor distT="0" distB="0" distL="114300" distR="114300" simplePos="0" relativeHeight="251661312" behindDoc="0" locked="0" layoutInCell="1" allowOverlap="1" wp14:anchorId="63BD9F3B" wp14:editId="7C927C36">
+                <wp:simplePos x="0" y="0"/>
+                <wp:positionH relativeFrom="column">
+                  <wp:posOffset>278457</wp:posOffset>
+                </wp:positionH>
+                <wp:positionV relativeFrom="paragraph">
+                  <wp:posOffset>157177</wp:posOffset>
+                </wp:positionV>
+                <wp:extent cx="0" cy="427838"/>
+                <wp:effectExtent l="76200" t="0" r="57150" b="48895"/>
+                <wp:wrapNone/>
+                <wp:docPr id="1062813874" name="Straight Arrow Connector 1"/>
+                <wp:cNvGraphicFramePr/>
+                <a:graphic xmlns:a="http://schemas.openxmlformats.org/drawingml/2006/main">
+                  <a:graphicData uri="http://schemas.microsoft.com/office/word/2010/wordprocessingShape">
+                    <wps:wsp>
+                      <wps:cNvCnPr/>
+                      <wps:spPr>
+                        <a:xfrm>
+                          <a:off x="0" y="0"/>
+                          <a:ext cx="0" cy="427838"/>
+                        </a:xfrm>
+                        <a:prstGeom prst="straightConnector1">
+                          <a:avLst/>
+                        </a:prstGeom>
+                        <a:ln>
+                          <a:tailEnd type="triangle"/>
+                        </a:ln>
+                      </wps:spPr>
+                      <wps:style>
+                        <a:lnRef idx="1">
+                          <a:schemeClr val="accent1"/>
+                        </a:lnRef>
+                        <a:fillRef idx="0">
+                          <a:schemeClr val="accent1"/>
+                        </a:fillRef>
+                        <a:effectRef idx="0">
+                          <a:schemeClr val="accent1"/>
+                        </a:effectRef>
+                        <a:fontRef idx="minor">
+                          <a:schemeClr val="tx1"/>
+                        </a:fontRef>
+                      </wps:style>
+                      <wps:bodyPr/>
+                    </wps:wsp>
+                  </a:graphicData>
+                </a:graphic>
+              </wp:anchor>
+            </w:drawing>
+          </mc:Choice>
+          <mc:Fallback>
+            <w:pict>
+              <v:shape w14:anchorId="60634FC5" id="Straight Arrow Connector 1" o:spid="_x0000_s1026" type="#_x0000_t32" style="position:absolute;margin-left:21.95pt;margin-top:12.4pt;width:0;height:33.7pt;z-index:251661312;visibility:visible;mso-wrap-style:square;mso-wrap-distance-left:9pt;mso-wrap-distance-top:0;mso-wrap-distance-right:9pt;mso-wrap-distance-bottom:0;mso-position-horizontal:absolute;mso-position-horizontal-relative:text;mso-position-vertical:absolute;mso-position-vertical-relative:text" o:gfxdata="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" strokecolor="#156082 [3204]" strokeweight=".5pt">
+                <v:stroke endarrow="block" joinstyle="miter"/>
+              </v:shape>
+            </w:pict>
+          </mc:Fallback>
+        </mc:AlternateContent>
+      </w:r>
+    </w:p>
+    <w:p/>
+    <w:p/>
+    <w:p>
+      <w:r>
+        <w:t>Company</w:t>
+      </w:r>
+      <w:r>
+        <w:tab/>
+      </w:r>
+      <w:r>
+        <w:tab/>
+        <w:t>Income</w:t>
+      </w:r>
+      <w:r>
+        <w:tab/>
+      </w:r>
+      <w:r>
+        <w:tab/>
+      </w:r>
+      <w:r>
+        <w:tab/>
+        <w:t>Expenses</w:t>
+      </w:r>
+    </w:p>
+    <w:p/>
+    <w:p>
+      <w:r>
+        <w:rPr>
+          <w:noProof/>
+        </w:rPr>
+        <mc:AlternateContent>
+          <mc:Choice Requires="wps">
+            <w:drawing>
+              <wp:anchor distT="0" distB="0" distL="114300" distR="114300" simplePos="0" relativeHeight="251664384" behindDoc="0" locked="0" layoutInCell="1" allowOverlap="1" wp14:anchorId="1AB42565" wp14:editId="0C0B5E40">
+                <wp:simplePos x="0" y="0"/>
+                <wp:positionH relativeFrom="column">
+                  <wp:posOffset>318782</wp:posOffset>
+                </wp:positionH>
+                <wp:positionV relativeFrom="paragraph">
+                  <wp:posOffset>16143</wp:posOffset>
+                </wp:positionV>
+                <wp:extent cx="0" cy="427838"/>
+                <wp:effectExtent l="76200" t="0" r="57150" b="48895"/>
+                <wp:wrapNone/>
+                <wp:docPr id="193654066" name="Straight Arrow Connector 1"/>
+                <wp:cNvGraphicFramePr/>
+                <a:graphic xmlns:a="http://schemas.openxmlformats.org/drawingml/2006/main">
+                  <a:graphicData uri="http://schemas.microsoft.com/office/word/2010/wordprocessingShape">
+                    <wps:wsp>
+                      <wps:cNvCnPr/>
+                      <wps:spPr>
+                        <a:xfrm>
+                          <a:off x="0" y="0"/>
+                          <a:ext cx="0" cy="427838"/>
+                        </a:xfrm>
+                        <a:prstGeom prst="straightConnector1">
+                          <a:avLst/>
+                        </a:prstGeom>
+                        <a:ln>
+                          <a:tailEnd type="triangle"/>
+                        </a:ln>
+                      </wps:spPr>
+                      <wps:style>
+                        <a:lnRef idx="1">
+                          <a:schemeClr val="accent1"/>
+                        </a:lnRef>
+                        <a:fillRef idx="0">
+                          <a:schemeClr val="accent1"/>
+                        </a:fillRef>
+                        <a:effectRef idx="0">
+                          <a:schemeClr val="accent1"/>
+                        </a:effectRef>
+                        <a:fontRef idx="minor">
+                          <a:schemeClr val="tx1"/>
+                        </a:fontRef>
+                      </wps:style>
+                      <wps:bodyPr/>
+                    </wps:wsp>
+                  </a:graphicData>
+                </a:graphic>
+              </wp:anchor>
+            </w:drawing>
+          </mc:Choice>
+          <mc:Fallback>
+            <w:pict>
+              <v:shape w14:anchorId="2CA37741" id="Straight Arrow Connector 1" o:spid="_x0000_s1026" type="#_x0000_t32" style="position:absolute;margin-left:25.1pt;margin-top:1.25pt;width:0;height:33.7pt;z-index:251664384;visibility:visible;mso-wrap-style:square;mso-wrap-distance-left:9pt;mso-wrap-distance-top:0;mso-wrap-distance-right:9pt;mso-wrap-distance-bottom:0;mso-position-horizontal:absolute;mso-position-horizontal-relative:text;mso-position-vertical:absolute;mso-position-vertical-relative:text" o:gfxdata="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" strokecolor="#156082 [3204]" strokeweight=".5pt">
+                <v:stroke endarrow="block" joinstyle="miter"/>
+              </v:shape>
+            </w:pict>
+          </mc:Fallback>
+        </mc:AlternateContent>
+      </w:r>
+    </w:p>
+    <w:p/>
+    <w:p/>
+    <w:p>
+      <w:r>
+        <w:t>Tax Calculator</w:t>
+      </w:r>
+    </w:p>
+    <w:p>
+      <w:r>
+        <w:rPr>
+          <w:noProof/>
+        </w:rPr>
+        <mc:AlternateContent>
+          <mc:Choice Requires="wps">
+            <w:drawing>
+              <wp:anchor distT="0" distB="0" distL="114300" distR="114300" simplePos="0" relativeHeight="251665408" behindDoc="0" locked="0" layoutInCell="1" allowOverlap="1" wp14:anchorId="2B2B6676" wp14:editId="3B0692F6">
+                <wp:simplePos x="0" y="0"/>
+                <wp:positionH relativeFrom="column">
+                  <wp:posOffset>318782</wp:posOffset>
+                </wp:positionH>
+                <wp:positionV relativeFrom="paragraph">
+                  <wp:posOffset>8279</wp:posOffset>
+                </wp:positionV>
+                <wp:extent cx="0" cy="427838"/>
+                <wp:effectExtent l="76200" t="0" r="57150" b="48895"/>
+                <wp:wrapNone/>
+                <wp:docPr id="2142641237" name="Straight Arrow Connector 1"/>
+                <wp:cNvGraphicFramePr/>
+                <a:graphic xmlns:a="http://schemas.openxmlformats.org/drawingml/2006/main">
+                  <a:graphicData uri="http://schemas.microsoft.com/office/word/2010/wordprocessingShape">
+                    <wps:wsp>
+                      <wps:cNvCnPr/>
+                      <wps:spPr>
+                        <a:xfrm>
+                          <a:off x="0" y="0"/>
+                          <a:ext cx="0" cy="427838"/>
+                        </a:xfrm>
+                        <a:prstGeom prst="straightConnector1">
+                          <a:avLst/>
+                        </a:prstGeom>
+                        <a:ln>
+                          <a:tailEnd type="triangle"/>
+                        </a:ln>
+                      </wps:spPr>
+                      <wps:style>
+                        <a:lnRef idx="1">
+                          <a:schemeClr val="accent1"/>
+                        </a:lnRef>
+                        <a:fillRef idx="0">
+                          <a:schemeClr val="accent1"/>
+                        </a:fillRef>
+                        <a:effectRef idx="0">
+                          <a:schemeClr val="accent1"/>
+                        </a:effectRef>
+                        <a:fontRef idx="minor">
+                          <a:schemeClr val="tx1"/>
+                        </a:fontRef>
+                      </wps:style>
+                      <wps:bodyPr/>
+                    </wps:wsp>
+                  </a:graphicData>
+                </a:graphic>
+              </wp:anchor>
+            </w:drawing>
+          </mc:Choice>
+          <mc:Fallback>
+            <w:pict>
+              <v:shape w14:anchorId="235F4B94" id="Straight Arrow Connector 1" o:spid="_x0000_s1026" type="#_x0000_t32" style="position:absolute;margin-left:25.1pt;margin-top:.65pt;width:0;height:33.7pt;z-index:251665408;visibility:visible;mso-wrap-style:square;mso-wrap-distance-left:9pt;mso-wrap-distance-top:0;mso-wrap-distance-right:9pt;mso-wrap-distance-bottom:0;mso-position-horizontal:absolute;mso-position-horizontal-relative:text;mso-position-vertical:absolute;mso-position-vertical-relative:text" o:gfxdata="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" strokecolor="#156082 [3204]" strokeweight=".5pt">
+                <v:stroke endarrow="block" joinstyle="miter"/>
+              </v:shape>
+            </w:pict>
+          </mc:Fallback>
+        </mc:AlternateContent>
+      </w:r>
+    </w:p>
+    <w:p/>
+    <w:p>
+      <w:r>
+        <w:t>Reports</w:t>
+      </w:r>
+    </w:p>
+    <w:p/>
+    <w:p/>
+    <w:p/>
+    <w:p>
+      <w:r>
+        <w:t>Order:</w:t>
+      </w:r>
+    </w:p>
+    <w:p>
+      <w:r>
+        <w:t xml:space="preserve">  </w:t>
+      </w:r>
+      <w:r>
+        <w:rPr>
+          <w:rFonts w:ascii="Segoe UI Emoji" w:hAnsi="Segoe UI Emoji" w:cs="Segoe UI Emoji"/>
+        </w:rPr>
+        <w:t>✅</w:t>
+      </w:r>
+      <w:r>
+        <w:t xml:space="preserve"> Flask project setup </w:t>
+      </w:r>
+    </w:p>
+    <w:p>
+      <w:r>
+        <w:t xml:space="preserve">  </w:t>
+      </w:r>
+      <w:r>
+        <w:rPr>
+          <w:rFonts w:ascii="Segoe UI Emoji" w:hAnsi="Segoe UI Emoji" w:cs="Segoe UI Emoji"/>
+        </w:rPr>
+        <w:t>✅</w:t>
+      </w:r>
+      <w:r>
+        <w:t xml:space="preserve"> Landing page </w:t>
+      </w:r>
+    </w:p>
+    <w:p>
+      <w:r>
+        <w:t xml:space="preserve">  </w:t>
+      </w:r>
+      <w:r>
+        <w:rPr>
+          <w:rFonts w:ascii="Segoe UI Emoji" w:hAnsi="Segoe UI Emoji" w:cs="Segoe UI Emoji"/>
+        </w:rPr>
+        <w:t>✅</w:t>
+      </w:r>
+      <w:r>
+        <w:t xml:space="preserve"> Login &amp; registration </w:t>
+      </w:r>
+    </w:p>
+    <w:p>
+      <w:r>
+        <w:t xml:space="preserve">  </w:t>
+      </w:r>
+      <w:r>
+        <w:rPr>
+          <w:rFonts w:ascii="Segoe UI Emoji" w:hAnsi="Segoe UI Emoji" w:cs="Segoe UI Emoji"/>
+        </w:rPr>
+        <w:t>✅</w:t>
+      </w:r>
+      <w:r>
+        <w:t xml:space="preserve"> Company profile </w:t>
+      </w:r>
+    </w:p>
+    <w:p>
+      <w:r>
+        <w:t xml:space="preserve">  </w:t>
+      </w:r>
+      <w:r>
+        <w:rPr>
+          <w:rFonts w:ascii="Segoe UI Emoji" w:hAnsi="Segoe UI Emoji" w:cs="Segoe UI Emoji"/>
+        </w:rPr>
+        <w:t>✅</w:t>
+      </w:r>
+      <w:r>
+        <w:t xml:space="preserve"> Dashboard </w:t>
+      </w:r>
+    </w:p>
+    <w:p>
+      <w:r>
+        <w:t xml:space="preserve">  </w:t>
+      </w:r>
+      <w:r>
+        <w:rPr>
+          <w:rFonts w:ascii="Segoe UI Emoji" w:hAnsi="Segoe UI Emoji" w:cs="Segoe UI Emoji"/>
+        </w:rPr>
+        <w:t>✅</w:t>
+      </w:r>
+      <w:r>
+        <w:t xml:space="preserve"> Income entry </w:t>
+      </w:r>
+    </w:p>
+    <w:p>
+      <w:r>
+        <w:lastRenderedPageBreak/>
+        <w:t xml:space="preserve">  </w:t>
+      </w:r>
+      <w:r>
+        <w:rPr>
+          <w:rFonts w:ascii="Segoe UI Emoji" w:hAnsi="Segoe UI Emoji" w:cs="Segoe UI Emoji"/>
+        </w:rPr>
+        <w:t>✅</w:t>
+      </w:r>
+      <w:r>
+        <w:t xml:space="preserve"> Expense entry </w:t>
+      </w:r>
+    </w:p>
+    <w:p>
+      <w:r>
+        <w:t xml:space="preserve">  </w:t>
+      </w:r>
+      <w:r>
+        <w:rPr>
+          <w:rFonts w:ascii="Segoe UI Emoji" w:hAnsi="Segoe UI Emoji" w:cs="Segoe UI Emoji"/>
+        </w:rPr>
+        <w:t>✅</w:t>
+      </w:r>
+      <w:r>
+        <w:t xml:space="preserve"> Database integration </w:t>
+      </w:r>
+    </w:p>
+    <w:p>
+      <w:r>
+        <w:t xml:space="preserve">  </w:t>
+      </w:r>
+      <w:r>
+        <w:rPr>
+          <w:rFonts w:ascii="Segoe UI Emoji" w:hAnsi="Segoe UI Emoji" w:cs="Segoe UI Emoji"/>
+        </w:rPr>
+        <w:t>✅</w:t>
+      </w:r>
+      <w:r>
+        <w:t xml:space="preserve"> Tax calculation engine </w:t>
+      </w:r>
+    </w:p>
+    <w:p>
+      <w:r>
+        <w:t xml:space="preserve">  </w:t>
+      </w:r>
+      <w:r>
+        <w:rPr>
+          <w:rFonts w:ascii="Segoe UI Emoji" w:hAnsi="Segoe UI Emoji" w:cs="Segoe UI Emoji"/>
+        </w:rPr>
+        <w:t>✅</w:t>
+      </w:r>
+      <w:r>
+        <w:t xml:space="preserve"> Report generation </w:t>
+      </w:r>
+    </w:p>
+    <w:p>
+      <w:r>
+        <w:t xml:space="preserve">  </w:t>
+      </w:r>
+      <w:r>
+        <w:rPr>
+          <w:rFonts w:ascii="Segoe UI Emoji" w:hAnsi="Segoe UI Emoji" w:cs="Segoe UI Emoji"/>
+        </w:rPr>
+        <w:t>✅</w:t>
+      </w:r>
+      <w:r>
+        <w:t xml:space="preserve"> User testing and validation</w:t>
+      </w:r>
+    </w:p>
+    <w:p/>
+    <w:p/>
+    <w:p/>
+    <w:p>
+      <w:r>
+        <w:rPr>
+          <w:highlight w:val="green"/>
+        </w:rPr>
+        <w:t xml:space="preserve">Step </w:t>
+      </w:r>
+      <w:r>
+        <w:rPr>
+          <w:highlight w:val="green"/>
+        </w:rPr>
+        <w:t>1: Get Flask running</w:t>
+      </w:r>
+      <w:r>
+        <w:t xml:space="preserve"> </w:t>
+      </w:r>
+    </w:p>
+    <w:p>
+      <w:r>
+        <w:rPr>
+          <w:highlight w:val="green"/>
+        </w:rPr>
+        <w:t>Step</w:t>
+      </w:r>
+      <w:r>
+        <w:rPr>
+          <w:highlight w:val="green"/>
+        </w:rPr>
+        <w:t xml:space="preserve"> 2: Plan pages</w:t>
+      </w:r>
+    </w:p>
+    <w:p>
+      <w:r>
+        <w:t>Homepage must have Dashboard, Projects,  Clients, Income, Expenses</w:t>
+      </w:r>
+      <w:r>
+        <w:t>,</w:t>
+      </w:r>
+      <w:r>
+        <w:t xml:space="preserve"> Reports, Settings (To be added: Meetings and Calendar for reminder</w:t>
+      </w:r>
+      <w:r>
+        <w:t xml:space="preserve"> + Tax Calculator</w:t>
+      </w:r>
+      <w:r>
+        <w:t>)</w:t>
+      </w:r>
+    </w:p>
+    <w:p>
+      <w:r>
+        <w:rPr>
+          <w:highlight w:val="green"/>
+        </w:rPr>
+        <w:t>Step</w:t>
+      </w:r>
+      <w:r>
+        <w:rPr>
+          <w:highlight w:val="green"/>
+        </w:rPr>
+        <w:t xml:space="preserve"> 3: Build base.html</w:t>
+      </w:r>
+    </w:p>
+    <w:p>
+      <w:r>
+        <w:t>Structure: Header &gt;&gt;&gt; Navigation &gt;&gt;&gt; Main Content &gt;&gt;&gt; Footer</w:t>
+      </w:r>
+    </w:p>
+    <w:p>
+      <w:r>
+        <w:rPr>
+          <w:highlight w:val="green"/>
+        </w:rPr>
+        <w:t xml:space="preserve">Step </w:t>
+      </w:r>
+      <w:r>
+        <w:rPr>
+          <w:highlight w:val="green"/>
+        </w:rPr>
+        <w:t>4</w:t>
+      </w:r>
+      <w:r>
+        <w:rPr>
+          <w:highlight w:val="green"/>
+        </w:rPr>
+        <w:t>: Routing</w:t>
+      </w:r>
+    </w:p>
+    <w:p>
+      <w:r>
+        <w:rPr>
+          <w:highlight w:val="green"/>
+        </w:rPr>
+        <w:t>Step 5: Create placeholder pages</w:t>
+      </w:r>
+    </w:p>
+    <w:p>
+      <w:r>
+        <w:t xml:space="preserve">Step </w:t>
+      </w:r>
+      <w:r>
+        <w:t>6</w:t>
+      </w:r>
+      <w:r>
+        <w:t>: Database connection</w:t>
+      </w:r>
+    </w:p>
+    <w:p/>
     <w:sectPr>
       <w:pgSz w:w="11906" w:h="16838"/>
       <w:pgMar w:top="1440" w:right="1440" w:bottom="1440" w:left="1440" w:header="708" w:footer="708" w:gutter="0"/>
@@ -3721,7 +4579,7 @@
 </file>
 
 <file path=word/numbering.xml><?xml version="1.0" encoding="utf-8"?>
-<w:numbering xmlns:wpc="http://schemas.microsoft.com/office/word/2010/wordprocessingCanvas" xmlns:cx="http://schemas.microsoft.com/office/drawing/2014/chartex" xmlns:cx1="http://schemas.microsoft.com/office/drawing/2015/9/8/chartex" xmlns:cx2="http://schemas.microsoft.com/office/drawing/2015/10/21/chartex" xmlns:cx3="http://schemas.microsoft.com/office/drawing/2016/5/9/chartex" xmlns:cx4="http://schemas.microsoft.com/office/drawing/2016/5/10/chartex" xmlns:cx5="http://schemas.microsoft.com/office/drawing/2016/5/11/chartex" xmlns:cx6="http://schemas.microsoft.com/office/drawing/2016/5/12/chartex" xmlns:cx7="http://schemas.microsoft.com/office/drawing/2016/5/13/chartex" xmlns:cx8="http://schemas.microsoft.com/office/drawing/2016/5/14/chartex" xmlns:mc="http://schemas.openxmlformats.org/markup-compatibility/2006" xmlns:aink="http://schemas.microsoft.com/office/drawing/2016/ink" xmlns:am3d="http://schemas.microsoft.com/office/drawing/2017/model3d" xmlns:o="urn:schemas-microsoft-com:office:office" xmlns:oel="http://schemas.microsoft.com/office/2019/extlst" xmlns:r="http://schemas.openxmlformats.org/officeDocument/2006/relationships" xmlns:m="http://schemas.openxmlformats.org/officeDocument/2006/math" xmlns:v="urn:schemas-microsoft-com:vml" xmlns:wp14="http://schemas.microsoft.com/office/word/2010/wordprocessingDrawing" xmlns:wp="http://schemas.openxmlformats.org/drawingml/2006/wordprocessingDrawing" xmlns:w10="urn:schemas-microsoft-com:office:word" xmlns:w="http://schemas.openxmlformats.org/wordprocessingml/2006/main" xmlns:w14="http://schemas.microsoft.com/office/word/2010/wordml" xmlns:w15="http://schemas.microsoft.com/office/word/2012/wordml" xmlns:w16cex="http://schemas.microsoft.com/office/word/2018/wordml/cex" xmlns:w16cid="http://schemas.microsoft.com/office/word/2016/wordml/cid" xmlns:w16="http://schemas.microsoft.com/office/word/2018/wordml" xmlns:w16du="http://schemas.microsoft.com/office/word/2023/wordml/word16du" xmlns:w16sdtdh="http://schemas.microsoft.com/office/word/2020/wordml/sdtdatahash" xmlns:w16sdtfl="http://schemas.microsoft.com/office/word/2024/wordml/sdtformatlock" xmlns:w16se="http://schemas.microsoft.com/office/word/2015/wordml/symex" xmlns:wpg="http://schemas.microsoft.com/office/word/2010/wordprocessingGroup" xmlns:wpi="http://schemas.microsoft.com/office/word/2010/wordprocessingInk" xmlns:wne="http://schemas.microsoft.com/office/word/2006/wordml" xmlns:wps="http://schemas.microsoft.com/office/word/2010/wordprocessingShape" mc:Ignorable="w14 w15 w16se w16cid w16 w16cex w16sdtdh w16sdtfl w16du wp14">
+<w:numbering xmlns:wpc="http://schemas.microsoft.com/office/word/2010/wordprocessingCanvas" xmlns:cx="http://schemas.microsoft.com/office/drawing/2014/chartex" xmlns:cx1="http://schemas.microsoft.com/office/drawing/2015/9/8/chartex" xmlns:cx2="http://schemas.microsoft.com/office/drawing/2015/10/21/chartex" xmlns:cx3="http://schemas.microsoft.com/office/drawing/2016/5/9/chartex" xmlns:cx4="http://schemas.microsoft.com/office/drawing/2016/5/10/chartex" xmlns:cx5="http://schemas.microsoft.com/office/drawing/2016/5/11/chartex" xmlns:cx6="http://schemas.microsoft.com/office/drawing/2016/5/12/chartex" xmlns:cx7="http://schemas.microsoft.com/office/drawing/2016/5/13/chartex" xmlns:cx8="http://schemas.microsoft.com/office/drawing/2016/5/14/chartex" xmlns:mc="http://schemas.openxmlformats.org/markup-compatibility/2006" xmlns:aink="http://schemas.microsoft.com/office/drawing/2016/ink" xmlns:am3d="http://schemas.microsoft.com/office/drawing/2017/model3d" xmlns:o="urn:schemas-microsoft-com:office:office" xmlns:oel="http://schemas.microsoft.com/office/2019/extlst" xmlns:r="http://schemas.openxmlformats.org/officeDocument/2006/relationships" xmlns:m="http://schemas.openxmlformats.org/officeDocument/2006/math" xmlns:v="urn:schemas-microsoft-com:vml" xmlns:wp14="http://schemas.microsoft.com/office/word/2010/wordprocessingDrawing" xmlns:wp="http://schemas.openxmlformats.org/drawingml/2006/wordprocessingDrawing" xmlns:w10="urn:schemas-microsoft-com:office:word" xmlns:w="http://schemas.openxmlformats.org/wordprocessingml/2006/main" xmlns:w14="http://schemas.microsoft.com/office/word/2010/wordml" xmlns:w15="http://schemas.microsoft.com/office/word/2012/wordml" xmlns:w16cei="http://schemas.microsoft.com/office/word/2026/wordml/cei" xmlns:w16cex="http://schemas.microsoft.com/office/word/2018/wordml/cex" xmlns:w16cid="http://schemas.microsoft.com/office/word/2016/wordml/cid" xmlns:w16="http://schemas.microsoft.com/office/word/2018/wordml" xmlns:w16du="http://schemas.microsoft.com/office/word/2023/wordml/word16du" xmlns:w16sdtdh="http://schemas.microsoft.com/office/word/2020/wordml/sdtdatahash" xmlns:w16sdtfl="http://schemas.microsoft.com/office/word/2024/wordml/sdtformatlock" xmlns:w16se="http://schemas.microsoft.com/office/word/2015/wordml/symex" xmlns:wpg="http://schemas.microsoft.com/office/word/2010/wordprocessingGroup" xmlns:wpi="http://schemas.microsoft.com/office/word/2010/wordprocessingInk" xmlns:wne="http://schemas.microsoft.com/office/word/2006/wordml" xmlns:wps="http://schemas.microsoft.com/office/word/2010/wordprocessingShape" mc:Ignorable="w14 w15 w16se w16cid w16 w16cex w16sdtdh w16sdtfl w16du wp14">
   <w:abstractNum w:abstractNumId="0" w15:restartNumberingAfterBreak="0">
     <w:nsid w:val="05053F38"/>
     <w:multiLevelType w:val="hybridMultilevel"/>
@@ -7282,6 +8140,7 @@
   <w:style w:type="character" w:default="1" w:styleId="DefaultParagraphFont">
     <w:name w:val="Default Paragraph Font"/>
     <w:uiPriority w:val="1"/>
+    <w:semiHidden/>
     <w:unhideWhenUsed/>
   </w:style>
   <w:style w:type="table" w:default="1" w:styleId="TableNormal">

</xml_diff>

<commit_message>
Add database extension setup
</commit_message>
<xml_diff>
--- a/tax_my_app_research_doc.docx
+++ b/tax_my_app_research_doc.docx
@@ -4459,6 +4459,201 @@
       </w:r>
     </w:p>
     <w:p/>
+    <w:p>
+      <w:r>
+        <w:t>M</w:t>
+      </w:r>
+      <w:r>
+        <w:t>ain</w:t>
+      </w:r>
+    </w:p>
+    <w:p>
+      <w:r>
+        <w:t xml:space="preserve"> </w:t>
+      </w:r>
+      <w:r>
+        <w:t>│</w:t>
+      </w:r>
+    </w:p>
+    <w:p>
+      <w:r>
+        <w:rPr>
+          <w:rFonts w:ascii="MS Gothic" w:eastAsia="MS Gothic" w:hAnsi="MS Gothic" w:cs="MS Gothic" w:hint="eastAsia"/>
+        </w:rPr>
+        <w:t>├</w:t>
+      </w:r>
+      <w:r>
+        <w:rPr>
+          <w:rFonts w:ascii="Aptos" w:hAnsi="Aptos" w:cs="Aptos"/>
+        </w:rPr>
+        <w:t>──</w:t>
+      </w:r>
+      <w:r>
+        <w:t xml:space="preserve"> feature/base-layout </w:t>
+      </w:r>
+    </w:p>
+    <w:p>
+      <w:r>
+        <w:rPr>
+          <w:rFonts w:ascii="MS Gothic" w:eastAsia="MS Gothic" w:hAnsi="MS Gothic" w:cs="MS Gothic" w:hint="eastAsia"/>
+        </w:rPr>
+        <w:t>├</w:t>
+      </w:r>
+      <w:r>
+        <w:rPr>
+          <w:rFonts w:ascii="Aptos" w:hAnsi="Aptos" w:cs="Aptos"/>
+        </w:rPr>
+        <w:t>──</w:t>
+      </w:r>
+      <w:r>
+        <w:t xml:space="preserve"> feature/authentication </w:t>
+      </w:r>
+    </w:p>
+    <w:p>
+      <w:r>
+        <w:rPr>
+          <w:rFonts w:ascii="MS Gothic" w:eastAsia="MS Gothic" w:hAnsi="MS Gothic" w:cs="MS Gothic" w:hint="eastAsia"/>
+        </w:rPr>
+        <w:t>├</w:t>
+      </w:r>
+      <w:r>
+        <w:rPr>
+          <w:rFonts w:ascii="Aptos" w:hAnsi="Aptos" w:cs="Aptos"/>
+        </w:rPr>
+        <w:t>──</w:t>
+      </w:r>
+      <w:r>
+        <w:t xml:space="preserve"> feature/database </w:t>
+      </w:r>
+    </w:p>
+    <w:p>
+      <w:r>
+        <w:rPr>
+          <w:rFonts w:ascii="MS Gothic" w:eastAsia="MS Gothic" w:hAnsi="MS Gothic" w:cs="MS Gothic" w:hint="eastAsia"/>
+        </w:rPr>
+        <w:t>├</w:t>
+      </w:r>
+      <w:r>
+        <w:rPr>
+          <w:rFonts w:ascii="Aptos" w:hAnsi="Aptos" w:cs="Aptos"/>
+        </w:rPr>
+        <w:t>──</w:t>
+      </w:r>
+      <w:r>
+        <w:t xml:space="preserve"> feature/company-profile</w:t>
+      </w:r>
+    </w:p>
+    <w:p>
+      <w:r>
+        <w:t xml:space="preserve"> </w:t>
+      </w:r>
+      <w:r>
+        <w:rPr>
+          <w:rFonts w:ascii="MS Gothic" w:eastAsia="MS Gothic" w:hAnsi="MS Gothic" w:cs="MS Gothic" w:hint="eastAsia"/>
+        </w:rPr>
+        <w:t>├</w:t>
+      </w:r>
+      <w:r>
+        <w:rPr>
+          <w:rFonts w:ascii="Aptos" w:hAnsi="Aptos" w:cs="Aptos"/>
+        </w:rPr>
+        <w:t>──</w:t>
+      </w:r>
+      <w:r>
+        <w:t xml:space="preserve"> feature/dashboard </w:t>
+      </w:r>
+    </w:p>
+    <w:p>
+      <w:r>
+        <w:rPr>
+          <w:rFonts w:ascii="MS Gothic" w:eastAsia="MS Gothic" w:hAnsi="MS Gothic" w:cs="MS Gothic" w:hint="eastAsia"/>
+        </w:rPr>
+        <w:t>├</w:t>
+      </w:r>
+      <w:r>
+        <w:rPr>
+          <w:rFonts w:ascii="Aptos" w:hAnsi="Aptos" w:cs="Aptos"/>
+        </w:rPr>
+        <w:t>──</w:t>
+      </w:r>
+      <w:r>
+        <w:t xml:space="preserve"> feature/income-management</w:t>
+      </w:r>
+    </w:p>
+    <w:p>
+      <w:r>
+        <w:t xml:space="preserve"> </w:t>
+      </w:r>
+      <w:r>
+        <w:rPr>
+          <w:rFonts w:ascii="MS Gothic" w:eastAsia="MS Gothic" w:hAnsi="MS Gothic" w:cs="MS Gothic" w:hint="eastAsia"/>
+        </w:rPr>
+        <w:t>├</w:t>
+      </w:r>
+      <w:r>
+        <w:rPr>
+          <w:rFonts w:ascii="Aptos" w:hAnsi="Aptos" w:cs="Aptos"/>
+        </w:rPr>
+        <w:t>──</w:t>
+      </w:r>
+      <w:r>
+        <w:t xml:space="preserve"> feature/expense-management</w:t>
+      </w:r>
+    </w:p>
+    <w:p>
+      <w:r>
+        <w:t xml:space="preserve"> </w:t>
+      </w:r>
+      <w:r>
+        <w:rPr>
+          <w:rFonts w:ascii="MS Gothic" w:eastAsia="MS Gothic" w:hAnsi="MS Gothic" w:cs="MS Gothic" w:hint="eastAsia"/>
+        </w:rPr>
+        <w:t>├</w:t>
+      </w:r>
+      <w:r>
+        <w:rPr>
+          <w:rFonts w:ascii="Aptos" w:hAnsi="Aptos" w:cs="Aptos"/>
+        </w:rPr>
+        <w:t>──</w:t>
+      </w:r>
+      <w:r>
+        <w:t xml:space="preserve"> feature/tax-engine</w:t>
+      </w:r>
+    </w:p>
+    <w:p>
+      <w:r>
+        <w:t xml:space="preserve"> </w:t>
+      </w:r>
+      <w:r>
+        <w:rPr>
+          <w:rFonts w:ascii="MS Gothic" w:eastAsia="MS Gothic" w:hAnsi="MS Gothic" w:cs="MS Gothic" w:hint="eastAsia"/>
+        </w:rPr>
+        <w:t>├</w:t>
+      </w:r>
+      <w:r>
+        <w:rPr>
+          <w:rFonts w:ascii="Aptos" w:hAnsi="Aptos" w:cs="Aptos"/>
+        </w:rPr>
+        <w:t>──</w:t>
+      </w:r>
+      <w:r>
+        <w:t xml:space="preserve"> feature/report-generation</w:t>
+      </w:r>
+    </w:p>
+    <w:p>
+      <w:r>
+        <w:t xml:space="preserve"> </w:t>
+      </w:r>
+      <w:r>
+        <w:rPr>
+          <w:rFonts w:ascii="Aptos" w:hAnsi="Aptos" w:cs="Aptos"/>
+        </w:rPr>
+        <w:t>└──</w:t>
+      </w:r>
+      <w:r>
+        <w:t xml:space="preserve"> feature/document-upload</w:t>
+      </w:r>
+    </w:p>
     <w:p/>
     <w:p/>
     <w:p>
@@ -4567,7 +4762,102 @@
         <w:t>: Database connection</w:t>
       </w:r>
     </w:p>
+    <w:p>
+      <w:r>
+        <w:t>Goal: Store and retrieve information</w:t>
+      </w:r>
+    </w:p>
+    <w:p>
+      <w:pPr>
+        <w:pStyle w:val="ListParagraph"/>
+        <w:numPr>
+          <w:ilvl w:val="2"/>
+          <w:numId w:val="20"/>
+        </w:numPr>
+      </w:pPr>
+      <w:r>
+        <w:t>Install database dependencies</w:t>
+      </w:r>
+    </w:p>
+    <w:p>
+      <w:pPr>
+        <w:pStyle w:val="ListParagraph"/>
+        <w:numPr>
+          <w:ilvl w:val="2"/>
+          <w:numId w:val="20"/>
+        </w:numPr>
+      </w:pPr>
+      <w:r>
+        <w:lastRenderedPageBreak/>
+        <w:t>Configure database connection</w:t>
+      </w:r>
+    </w:p>
+    <w:p>
+      <w:pPr>
+        <w:pStyle w:val="ListParagraph"/>
+        <w:numPr>
+          <w:ilvl w:val="2"/>
+          <w:numId w:val="20"/>
+        </w:numPr>
+      </w:pPr>
+      <w:r>
+        <w:t xml:space="preserve">Create model structure (not table ) &gt;&gt;&gt;&gt; models/ user.py(id, name, email, password, timestamp), company.py (id, owner id, company name, </w:t>
+      </w:r>
+      <w:proofErr w:type="spellStart"/>
+      <w:r>
+        <w:t>ssm</w:t>
+      </w:r>
+      <w:proofErr w:type="spellEnd"/>
+      <w:r>
+        <w:t xml:space="preserve"> number, industry, financial year end, timestamp), income.py (id, company id, client name, </w:t>
+      </w:r>
+      <w:proofErr w:type="spellStart"/>
+      <w:r>
+        <w:t>desc</w:t>
+      </w:r>
+      <w:proofErr w:type="spellEnd"/>
+      <w:r>
+        <w:t xml:space="preserve">, amount, date), expense.py (id, company id, category, </w:t>
+      </w:r>
+      <w:proofErr w:type="spellStart"/>
+      <w:r>
+        <w:t>desc</w:t>
+      </w:r>
+      <w:proofErr w:type="spellEnd"/>
+      <w:r>
+        <w:t>, amount, date, receipt)</w:t>
+      </w:r>
+    </w:p>
+    <w:p>
+      <w:pPr>
+        <w:pStyle w:val="ListParagraph"/>
+        <w:numPr>
+          <w:ilvl w:val="2"/>
+          <w:numId w:val="20"/>
+        </w:numPr>
+      </w:pPr>
+      <w:r>
+        <w:t>Create database initialisation</w:t>
+      </w:r>
+    </w:p>
+    <w:p>
+      <w:pPr>
+        <w:pStyle w:val="ListParagraph"/>
+        <w:numPr>
+          <w:ilvl w:val="2"/>
+          <w:numId w:val="20"/>
+        </w:numPr>
+      </w:pPr>
+      <w:r>
+        <w:t>Test database operations (CRUD functionality)</w:t>
+      </w:r>
+    </w:p>
     <w:p/>
+    <w:p>
+      <w:r>
+        <w:t>Step 7: Authentication</w:t>
+      </w:r>
+    </w:p>
     <w:sectPr>
       <w:pgSz w:w="11906" w:h="16838"/>
       <w:pgMar w:top="1440" w:right="1440" w:bottom="1440" w:left="1440" w:header="708" w:footer="708" w:gutter="0"/>
@@ -6968,7 +7258,7 @@
   <w:abstractNum w:abstractNumId="19" w15:restartNumberingAfterBreak="0">
     <w:nsid w:val="66435C03"/>
     <w:multiLevelType w:val="multilevel"/>
-    <w:tmpl w:val="4464415E"/>
+    <w:tmpl w:val="6472C53C"/>
     <w:lvl w:ilvl="0">
       <w:start w:val="1"/>
       <w:numFmt w:val="bullet"/>
@@ -7001,20 +7291,16 @@
         <w:sz w:val="20"/>
       </w:rPr>
     </w:lvl>
-    <w:lvl w:ilvl="2" w:tentative="1">
-      <w:start w:val="1"/>
-      <w:numFmt w:val="bullet"/>
-      <w:lvlText w:val=""/>
-      <w:lvlJc w:val="left"/>
-      <w:pPr>
-        <w:tabs>
-          <w:tab w:val="num" w:pos="2160"/>
-        </w:tabs>
-        <w:ind w:left="2160" w:hanging="360"/>
-      </w:pPr>
-      <w:rPr>
-        <w:rFonts w:ascii="Wingdings" w:hAnsi="Wingdings" w:hint="default"/>
-        <w:sz w:val="20"/>
+    <w:lvl w:ilvl="2">
+      <w:start w:val="1"/>
+      <w:numFmt w:val="lowerRoman"/>
+      <w:lvlText w:val="%3."/>
+      <w:lvlJc w:val="left"/>
+      <w:pPr>
+        <w:ind w:left="2520" w:hanging="720"/>
+      </w:pPr>
+      <w:rPr>
+        <w:rFonts w:hint="default"/>
       </w:rPr>
     </w:lvl>
     <w:lvl w:ilvl="3" w:tentative="1">
@@ -8140,7 +8426,6 @@
   <w:style w:type="character" w:default="1" w:styleId="DefaultParagraphFont">
     <w:name w:val="Default Paragraph Font"/>
     <w:uiPriority w:val="1"/>
-    <w:semiHidden/>
     <w:unhideWhenUsed/>
   </w:style>
   <w:style w:type="table" w:default="1" w:styleId="TableNormal">

</xml_diff>

<commit_message>
Update milestone in document
</commit_message>
<xml_diff>
--- a/tax_my_app_research_doc.docx
+++ b/tax_my_app_research_doc.docx
@@ -3813,7 +3813,7 @@
           </mc:Choice>
           <mc:Fallback>
             <w:pict>
-              <v:shapetype w14:anchorId="6DDB1BB6" id="_x0000_t32" coordsize="21600,21600" o:spt="32" o:oned="t" path="m,l21600,21600e" filled="f">
+              <v:shapetype w14:anchorId="60111AA7" id="_x0000_t32" coordsize="21600,21600" o:spt="32" o:oned="t" path="m,l21600,21600e" filled="f">
                 <v:path arrowok="t" fillok="f" o:connecttype="none"/>
                 <o:lock v:ext="edit" shapetype="t"/>
               </v:shapetype>
@@ -3895,7 +3895,7 @@
           </mc:Choice>
           <mc:Fallback>
             <w:pict>
-              <v:shape w14:anchorId="2062C957" id="Straight Arrow Connector 1" o:spid="_x0000_s1026" type="#_x0000_t32" style="position:absolute;margin-left:27.1pt;margin-top:.7pt;width:0;height:33.7pt;z-index:251660288;visibility:visible;mso-wrap-style:square;mso-wrap-distance-left:9pt;mso-wrap-distance-top:0;mso-wrap-distance-right:9pt;mso-wrap-distance-bottom:0;mso-position-horizontal:absolute;mso-position-horizontal-relative:text;mso-position-vertical:absolute;mso-position-vertical-relative:text" o:gfxdata="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" strokecolor="#156082 [3204]" strokeweight=".5pt">
+              <v:shape w14:anchorId="10A54AF3" id="Straight Arrow Connector 1" o:spid="_x0000_s1026" type="#_x0000_t32" style="position:absolute;margin-left:27.1pt;margin-top:.7pt;width:0;height:33.7pt;z-index:251660288;visibility:visible;mso-wrap-style:square;mso-wrap-distance-left:9pt;mso-wrap-distance-top:0;mso-wrap-distance-right:9pt;mso-wrap-distance-bottom:0;mso-position-horizontal:absolute;mso-position-horizontal-relative:text;mso-position-vertical:absolute;mso-position-vertical-relative:text" o:gfxdata="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" strokecolor="#156082 [3204]" strokeweight=".5pt">
                 <v:stroke endarrow="block" joinstyle="miter"/>
               </v:shape>
             </w:pict>
@@ -3975,7 +3975,7 @@
           </mc:Choice>
           <mc:Fallback>
             <w:pict>
-              <v:shape w14:anchorId="6CC78231" id="Straight Arrow Connector 1" o:spid="_x0000_s1026" type="#_x0000_t32" style="position:absolute;margin-left:73.3pt;margin-top:.4pt;width:144.65pt;height:53.5pt;z-index:251663360;visibility:visible;mso-wrap-style:square;mso-width-percent:0;mso-height-percent:0;mso-wrap-distance-left:9pt;mso-wrap-distance-top:0;mso-wrap-distance-right:9pt;mso-wrap-distance-bottom:0;mso-position-horizontal:absolute;mso-position-horizontal-relative:text;mso-position-vertical:absolute;mso-position-vertical-relative:text;mso-width-percent:0;mso-height-percent:0;mso-width-relative:margin;mso-height-relative:margin" o:gfxdata="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" strokecolor="#156082 [3204]" strokeweight=".5pt">
+              <v:shape w14:anchorId="18D814B3" id="Straight Arrow Connector 1" o:spid="_x0000_s1026" type="#_x0000_t32" style="position:absolute;margin-left:73.3pt;margin-top:.4pt;width:144.65pt;height:53.5pt;z-index:251663360;visibility:visible;mso-wrap-style:square;mso-width-percent:0;mso-height-percent:0;mso-wrap-distance-left:9pt;mso-wrap-distance-top:0;mso-wrap-distance-right:9pt;mso-wrap-distance-bottom:0;mso-position-horizontal:absolute;mso-position-horizontal-relative:text;mso-position-vertical:absolute;mso-position-vertical-relative:text;mso-width-percent:0;mso-height-percent:0;mso-width-relative:margin;mso-height-relative:margin" o:gfxdata="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" strokecolor="#156082 [3204]" strokeweight=".5pt">
                 <v:stroke endarrow="block" joinstyle="miter"/>
               </v:shape>
             </w:pict>
@@ -4047,7 +4047,7 @@
           </mc:Choice>
           <mc:Fallback>
             <w:pict>
-              <v:shape w14:anchorId="6D2002C5" id="Straight Arrow Connector 1" o:spid="_x0000_s1026" type="#_x0000_t32" style="position:absolute;margin-left:49.55pt;margin-top:9pt;width:56.75pt;height:42.95pt;z-index:251662336;visibility:visible;mso-wrap-style:square;mso-width-percent:0;mso-height-percent:0;mso-wrap-distance-left:9pt;mso-wrap-distance-top:0;mso-wrap-distance-right:9pt;mso-wrap-distance-bottom:0;mso-position-horizontal:absolute;mso-position-horizontal-relative:text;mso-position-vertical:absolute;mso-position-vertical-relative:text;mso-width-percent:0;mso-height-percent:0;mso-width-relative:margin;mso-height-relative:margin" o:gfxdata="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" strokecolor="#156082 [3204]" strokeweight=".5pt">
+              <v:shape w14:anchorId="6AA7B17E" id="Straight Arrow Connector 1" o:spid="_x0000_s1026" type="#_x0000_t32" style="position:absolute;margin-left:49.55pt;margin-top:9pt;width:56.75pt;height:42.95pt;z-index:251662336;visibility:visible;mso-wrap-style:square;mso-width-percent:0;mso-height-percent:0;mso-wrap-distance-left:9pt;mso-wrap-distance-top:0;mso-wrap-distance-right:9pt;mso-wrap-distance-bottom:0;mso-position-horizontal:absolute;mso-position-horizontal-relative:text;mso-position-vertical:absolute;mso-position-vertical-relative:text;mso-width-percent:0;mso-height-percent:0;mso-width-relative:margin;mso-height-relative:margin" o:gfxdata="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" strokecolor="#156082 [3204]" strokeweight=".5pt">
                 <v:stroke endarrow="block" joinstyle="miter"/>
               </v:shape>
             </w:pict>
@@ -4113,7 +4113,7 @@
           </mc:Choice>
           <mc:Fallback>
             <w:pict>
-              <v:shape w14:anchorId="01473CB3" id="Straight Arrow Connector 1" o:spid="_x0000_s1026" type="#_x0000_t32" style="position:absolute;margin-left:21.95pt;margin-top:12.4pt;width:0;height:33.7pt;z-index:251661312;visibility:visible;mso-wrap-style:square;mso-wrap-distance-left:9pt;mso-wrap-distance-top:0;mso-wrap-distance-right:9pt;mso-wrap-distance-bottom:0;mso-position-horizontal:absolute;mso-position-horizontal-relative:text;mso-position-vertical:absolute;mso-position-vertical-relative:text" o:gfxdata="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" strokecolor="#156082 [3204]" strokeweight=".5pt">
+              <v:shape w14:anchorId="71F9A4EA" id="Straight Arrow Connector 1" o:spid="_x0000_s1026" type="#_x0000_t32" style="position:absolute;margin-left:21.95pt;margin-top:12.4pt;width:0;height:33.7pt;z-index:251661312;visibility:visible;mso-wrap-style:square;mso-wrap-distance-left:9pt;mso-wrap-distance-top:0;mso-wrap-distance-right:9pt;mso-wrap-distance-bottom:0;mso-position-horizontal:absolute;mso-position-horizontal-relative:text;mso-position-vertical:absolute;mso-position-vertical-relative:text" o:gfxdata="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" strokecolor="#156082 [3204]" strokeweight=".5pt">
                 <v:stroke endarrow="block" joinstyle="miter"/>
               </v:shape>
             </w:pict>
@@ -4206,7 +4206,7 @@
           </mc:Choice>
           <mc:Fallback>
             <w:pict>
-              <v:shape w14:anchorId="0BC813F0" id="Straight Arrow Connector 1" o:spid="_x0000_s1026" type="#_x0000_t32" style="position:absolute;margin-left:25.1pt;margin-top:1.25pt;width:0;height:33.7pt;z-index:251664384;visibility:visible;mso-wrap-style:square;mso-wrap-distance-left:9pt;mso-wrap-distance-top:0;mso-wrap-distance-right:9pt;mso-wrap-distance-bottom:0;mso-position-horizontal:absolute;mso-position-horizontal-relative:text;mso-position-vertical:absolute;mso-position-vertical-relative:text" o:gfxdata="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" strokecolor="#156082 [3204]" strokeweight=".5pt">
+              <v:shape w14:anchorId="728725B9" id="Straight Arrow Connector 1" o:spid="_x0000_s1026" type="#_x0000_t32" style="position:absolute;margin-left:25.1pt;margin-top:1.25pt;width:0;height:33.7pt;z-index:251664384;visibility:visible;mso-wrap-style:square;mso-wrap-distance-left:9pt;mso-wrap-distance-top:0;mso-wrap-distance-right:9pt;mso-wrap-distance-bottom:0;mso-position-horizontal:absolute;mso-position-horizontal-relative:text;mso-position-vertical:absolute;mso-position-vertical-relative:text" o:gfxdata="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" strokecolor="#156082 [3204]" strokeweight=".5pt">
                 <v:stroke endarrow="block" joinstyle="miter"/>
               </v:shape>
             </w:pict>
@@ -4281,7 +4281,7 @@
           </mc:Choice>
           <mc:Fallback>
             <w:pict>
-              <v:shape w14:anchorId="1C4F65D7" id="Straight Arrow Connector 1" o:spid="_x0000_s1026" type="#_x0000_t32" style="position:absolute;margin-left:25.1pt;margin-top:.65pt;width:0;height:33.7pt;z-index:251665408;visibility:visible;mso-wrap-style:square;mso-wrap-distance-left:9pt;mso-wrap-distance-top:0;mso-wrap-distance-right:9pt;mso-wrap-distance-bottom:0;mso-position-horizontal:absolute;mso-position-horizontal-relative:text;mso-position-vertical:absolute;mso-position-vertical-relative:text" o:gfxdata="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" strokecolor="#156082 [3204]" strokeweight=".5pt">
+              <v:shape w14:anchorId="12C65A1F" id="Straight Arrow Connector 1" o:spid="_x0000_s1026" type="#_x0000_t32" style="position:absolute;margin-left:25.1pt;margin-top:.65pt;width:0;height:33.7pt;z-index:251665408;visibility:visible;mso-wrap-style:square;mso-wrap-distance-left:9pt;mso-wrap-distance-top:0;mso-wrap-distance-right:9pt;mso-wrap-distance-bottom:0;mso-position-horizontal:absolute;mso-position-horizontal-relative:text;mso-position-vertical:absolute;mso-position-vertical-relative:text" o:gfxdata="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" strokecolor="#156082 [3204]" strokeweight=".5pt">
                 <v:stroke endarrow="block" joinstyle="miter"/>
               </v:shape>
             </w:pict>
@@ -4755,12 +4755,21 @@
     </w:p>
     <w:p>
       <w:r>
+        <w:rPr>
+          <w:highlight w:val="green"/>
+        </w:rPr>
         <w:t xml:space="preserve">Step </w:t>
       </w:r>
       <w:r>
+        <w:rPr>
+          <w:highlight w:val="green"/>
+        </w:rPr>
         <w:t>6</w:t>
       </w:r>
       <w:r>
+        <w:rPr>
+          <w:highlight w:val="green"/>
+        </w:rPr>
         <w:t>: Database connection</w:t>
       </w:r>
     </w:p>
@@ -4932,21 +4941,128 @@
       </w:r>
     </w:p>
     <w:p>
+      <w:r>
+        <w:t>Step 7: Authentication</w:t>
+      </w:r>
+    </w:p>
+    <w:p>
       <w:pPr>
         <w:pStyle w:val="ListParagraph"/>
         <w:numPr>
-          <w:ilvl w:val="2"/>
-          <w:numId w:val="20"/>
+          <w:ilvl w:val="0"/>
+          <w:numId w:val="24"/>
         </w:numPr>
-      </w:pPr>
-      <w:r>
-        <w:t>Test database operations (CRUD functionality)</w:t>
-      </w:r>
-    </w:p>
-    <w:p/>
-    <w:p>
-      <w:r>
-        <w:t>Step 7: Authentication</w:t>
+        <w:rPr>
+          <w:highlight w:val="darkGreen"/>
+        </w:rPr>
+      </w:pPr>
+      <w:r>
+        <w:rPr>
+          <w:highlight w:val="darkGreen"/>
+        </w:rPr>
+        <w:t>Flask Login dependency (requirements.txt)</w:t>
+      </w:r>
+    </w:p>
+    <w:p>
+      <w:pPr>
+        <w:pStyle w:val="ListParagraph"/>
+        <w:numPr>
+          <w:ilvl w:val="0"/>
+          <w:numId w:val="24"/>
+        </w:numPr>
+        <w:rPr>
+          <w:highlight w:val="darkGreen"/>
+        </w:rPr>
+      </w:pPr>
+      <w:r>
+        <w:rPr>
+          <w:highlight w:val="darkGreen"/>
+        </w:rPr>
+        <w:t>Configure flask-login extension</w:t>
+      </w:r>
+    </w:p>
+    <w:p>
+      <w:pPr>
+        <w:pStyle w:val="ListParagraph"/>
+        <w:numPr>
+          <w:ilvl w:val="0"/>
+          <w:numId w:val="24"/>
+        </w:numPr>
+        <w:rPr>
+          <w:highlight w:val="darkGreen"/>
+        </w:rPr>
+      </w:pPr>
+      <w:r>
+        <w:rPr>
+          <w:highlight w:val="darkGreen"/>
+        </w:rPr>
+        <w:t>Update user model</w:t>
+      </w:r>
+    </w:p>
+    <w:p>
+      <w:pPr>
+        <w:pStyle w:val="ListParagraph"/>
+        <w:numPr>
+          <w:ilvl w:val="0"/>
+          <w:numId w:val="24"/>
+        </w:numPr>
+        <w:rPr>
+          <w:highlight w:val="darkGreen"/>
+        </w:rPr>
+      </w:pPr>
+      <w:r>
+        <w:rPr>
+          <w:highlight w:val="darkGreen"/>
+        </w:rPr>
+        <w:t>Create auth routes</w:t>
+      </w:r>
+    </w:p>
+    <w:p>
+      <w:pPr>
+        <w:pStyle w:val="ListParagraph"/>
+        <w:numPr>
+          <w:ilvl w:val="0"/>
+          <w:numId w:val="24"/>
+        </w:numPr>
+        <w:rPr>
+          <w:highlight w:val="darkGreen"/>
+        </w:rPr>
+      </w:pPr>
+      <w:r>
+        <w:rPr>
+          <w:highlight w:val="darkGreen"/>
+        </w:rPr>
+        <w:t>Create login interface</w:t>
+      </w:r>
+    </w:p>
+    <w:p>
+      <w:pPr>
+        <w:pStyle w:val="ListParagraph"/>
+        <w:numPr>
+          <w:ilvl w:val="0"/>
+          <w:numId w:val="24"/>
+        </w:numPr>
+        <w:rPr>
+          <w:highlight w:val="darkGreen"/>
+        </w:rPr>
+      </w:pPr>
+      <w:r>
+        <w:rPr>
+          <w:highlight w:val="darkGreen"/>
+        </w:rPr>
+        <w:t>Connect login page to auth route</w:t>
+      </w:r>
+    </w:p>
+    <w:p>
+      <w:pPr>
+        <w:pStyle w:val="ListParagraph"/>
+        <w:numPr>
+          <w:ilvl w:val="0"/>
+          <w:numId w:val="24"/>
+        </w:numPr>
+      </w:pPr>
+      <w:r>
+        <w:t>Protect app routes</w:t>
       </w:r>
     </w:p>
     <w:sectPr>
@@ -6772,6 +6888,95 @@
     </w:lvl>
   </w:abstractNum>
   <w:abstractNum w:abstractNumId="14" w15:restartNumberingAfterBreak="0">
+    <w:nsid w:val="444971F6"/>
+    <w:multiLevelType w:val="hybridMultilevel"/>
+    <w:tmpl w:val="E1E6ED50"/>
+    <w:lvl w:ilvl="0" w:tplc="986CD6E0">
+      <w:start w:val="1"/>
+      <w:numFmt w:val="lowerRoman"/>
+      <w:lvlText w:val="%1."/>
+      <w:lvlJc w:val="left"/>
+      <w:pPr>
+        <w:ind w:left="1080" w:hanging="720"/>
+      </w:pPr>
+      <w:rPr>
+        <w:rFonts w:hint="default"/>
+      </w:rPr>
+    </w:lvl>
+    <w:lvl w:ilvl="1" w:tplc="18090019" w:tentative="1">
+      <w:start w:val="1"/>
+      <w:numFmt w:val="lowerLetter"/>
+      <w:lvlText w:val="%2."/>
+      <w:lvlJc w:val="left"/>
+      <w:pPr>
+        <w:ind w:left="1440" w:hanging="360"/>
+      </w:pPr>
+    </w:lvl>
+    <w:lvl w:ilvl="2" w:tplc="1809001B" w:tentative="1">
+      <w:start w:val="1"/>
+      <w:numFmt w:val="lowerRoman"/>
+      <w:lvlText w:val="%3."/>
+      <w:lvlJc w:val="right"/>
+      <w:pPr>
+        <w:ind w:left="2160" w:hanging="180"/>
+      </w:pPr>
+    </w:lvl>
+    <w:lvl w:ilvl="3" w:tplc="1809000F" w:tentative="1">
+      <w:start w:val="1"/>
+      <w:numFmt w:val="decimal"/>
+      <w:lvlText w:val="%4."/>
+      <w:lvlJc w:val="left"/>
+      <w:pPr>
+        <w:ind w:left="2880" w:hanging="360"/>
+      </w:pPr>
+    </w:lvl>
+    <w:lvl w:ilvl="4" w:tplc="18090019" w:tentative="1">
+      <w:start w:val="1"/>
+      <w:numFmt w:val="lowerLetter"/>
+      <w:lvlText w:val="%5."/>
+      <w:lvlJc w:val="left"/>
+      <w:pPr>
+        <w:ind w:left="3600" w:hanging="360"/>
+      </w:pPr>
+    </w:lvl>
+    <w:lvl w:ilvl="5" w:tplc="1809001B" w:tentative="1">
+      <w:start w:val="1"/>
+      <w:numFmt w:val="lowerRoman"/>
+      <w:lvlText w:val="%6."/>
+      <w:lvlJc w:val="right"/>
+      <w:pPr>
+        <w:ind w:left="4320" w:hanging="180"/>
+      </w:pPr>
+    </w:lvl>
+    <w:lvl w:ilvl="6" w:tplc="1809000F" w:tentative="1">
+      <w:start w:val="1"/>
+      <w:numFmt w:val="decimal"/>
+      <w:lvlText w:val="%7."/>
+      <w:lvlJc w:val="left"/>
+      <w:pPr>
+        <w:ind w:left="5040" w:hanging="360"/>
+      </w:pPr>
+    </w:lvl>
+    <w:lvl w:ilvl="7" w:tplc="18090019" w:tentative="1">
+      <w:start w:val="1"/>
+      <w:numFmt w:val="lowerLetter"/>
+      <w:lvlText w:val="%8."/>
+      <w:lvlJc w:val="left"/>
+      <w:pPr>
+        <w:ind w:left="5760" w:hanging="360"/>
+      </w:pPr>
+    </w:lvl>
+    <w:lvl w:ilvl="8" w:tplc="1809001B" w:tentative="1">
+      <w:start w:val="1"/>
+      <w:numFmt w:val="lowerRoman"/>
+      <w:lvlText w:val="%9."/>
+      <w:lvlJc w:val="right"/>
+      <w:pPr>
+        <w:ind w:left="6480" w:hanging="180"/>
+      </w:pPr>
+    </w:lvl>
+  </w:abstractNum>
+  <w:abstractNum w:abstractNumId="15" w15:restartNumberingAfterBreak="0">
     <w:nsid w:val="4AAB35E7"/>
     <w:multiLevelType w:val="hybridMultilevel"/>
     <w:tmpl w:val="33468086"/>
@@ -6860,7 +7065,7 @@
       </w:pPr>
     </w:lvl>
   </w:abstractNum>
-  <w:abstractNum w:abstractNumId="15" w15:restartNumberingAfterBreak="0">
+  <w:abstractNum w:abstractNumId="16" w15:restartNumberingAfterBreak="0">
     <w:nsid w:val="55C351DD"/>
     <w:multiLevelType w:val="hybridMultilevel"/>
     <w:tmpl w:val="4AEE18A8"/>
@@ -6972,7 +7177,7 @@
       </w:rPr>
     </w:lvl>
   </w:abstractNum>
-  <w:abstractNum w:abstractNumId="16" w15:restartNumberingAfterBreak="0">
+  <w:abstractNum w:abstractNumId="17" w15:restartNumberingAfterBreak="0">
     <w:nsid w:val="57F04BA7"/>
     <w:multiLevelType w:val="hybridMultilevel"/>
     <w:tmpl w:val="89FAC4E8"/>
@@ -7084,7 +7289,7 @@
       </w:rPr>
     </w:lvl>
   </w:abstractNum>
-  <w:abstractNum w:abstractNumId="17" w15:restartNumberingAfterBreak="0">
+  <w:abstractNum w:abstractNumId="18" w15:restartNumberingAfterBreak="0">
     <w:nsid w:val="5CF55B61"/>
     <w:multiLevelType w:val="multilevel"/>
     <w:tmpl w:val="E83007CA"/>
@@ -7197,7 +7402,7 @@
       </w:pPr>
     </w:lvl>
   </w:abstractNum>
-  <w:abstractNum w:abstractNumId="18" w15:restartNumberingAfterBreak="0">
+  <w:abstractNum w:abstractNumId="19" w15:restartNumberingAfterBreak="0">
     <w:nsid w:val="5F517807"/>
     <w:multiLevelType w:val="multilevel"/>
     <w:tmpl w:val="D6483B3A"/>
@@ -7346,7 +7551,7 @@
       </w:rPr>
     </w:lvl>
   </w:abstractNum>
-  <w:abstractNum w:abstractNumId="19" w15:restartNumberingAfterBreak="0">
+  <w:abstractNum w:abstractNumId="20" w15:restartNumberingAfterBreak="0">
     <w:nsid w:val="66435C03"/>
     <w:multiLevelType w:val="multilevel"/>
     <w:tmpl w:val="6472C53C"/>
@@ -7491,7 +7696,7 @@
       </w:rPr>
     </w:lvl>
   </w:abstractNum>
-  <w:abstractNum w:abstractNumId="20" w15:restartNumberingAfterBreak="0">
+  <w:abstractNum w:abstractNumId="21" w15:restartNumberingAfterBreak="0">
     <w:nsid w:val="6BDE049C"/>
     <w:multiLevelType w:val="hybridMultilevel"/>
     <w:tmpl w:val="BF82618A"/>
@@ -7580,7 +7785,7 @@
       </w:pPr>
     </w:lvl>
   </w:abstractNum>
-  <w:abstractNum w:abstractNumId="21" w15:restartNumberingAfterBreak="0">
+  <w:abstractNum w:abstractNumId="22" w15:restartNumberingAfterBreak="0">
     <w:nsid w:val="6C374FE2"/>
     <w:multiLevelType w:val="hybridMultilevel"/>
     <w:tmpl w:val="63CE2C92"/>
@@ -7693,7 +7898,7 @@
       </w:rPr>
     </w:lvl>
   </w:abstractNum>
-  <w:abstractNum w:abstractNumId="22" w15:restartNumberingAfterBreak="0">
+  <w:abstractNum w:abstractNumId="23" w15:restartNumberingAfterBreak="0">
     <w:nsid w:val="6D0A6477"/>
     <w:multiLevelType w:val="multilevel"/>
     <w:tmpl w:val="088E7932"/>
@@ -7843,10 +8048,10 @@
     </w:lvl>
   </w:abstractNum>
   <w:num w:numId="1" w16cid:durableId="687365248">
-    <w:abstractNumId w:val="16"/>
+    <w:abstractNumId w:val="17"/>
   </w:num>
   <w:num w:numId="2" w16cid:durableId="217130696">
-    <w:abstractNumId w:val="15"/>
+    <w:abstractNumId w:val="16"/>
   </w:num>
   <w:num w:numId="3" w16cid:durableId="1326470716">
     <w:abstractNumId w:val="0"/>
@@ -7855,7 +8060,7 @@
     <w:abstractNumId w:val="9"/>
   </w:num>
   <w:num w:numId="5" w16cid:durableId="1098409054">
-    <w:abstractNumId w:val="21"/>
+    <w:abstractNumId w:val="22"/>
   </w:num>
   <w:num w:numId="6" w16cid:durableId="444812254">
     <w:abstractNumId w:val="2"/>
@@ -7864,16 +8069,16 @@
     <w:abstractNumId w:val="13"/>
   </w:num>
   <w:num w:numId="8" w16cid:durableId="934286284">
-    <w:abstractNumId w:val="20"/>
+    <w:abstractNumId w:val="21"/>
   </w:num>
   <w:num w:numId="9" w16cid:durableId="2068608718">
-    <w:abstractNumId w:val="14"/>
+    <w:abstractNumId w:val="15"/>
   </w:num>
   <w:num w:numId="10" w16cid:durableId="302345709">
     <w:abstractNumId w:val="3"/>
   </w:num>
   <w:num w:numId="11" w16cid:durableId="200896949">
-    <w:abstractNumId w:val="22"/>
+    <w:abstractNumId w:val="23"/>
   </w:num>
   <w:num w:numId="12" w16cid:durableId="643777150">
     <w:abstractNumId w:val="6"/>
@@ -7882,7 +8087,7 @@
     <w:abstractNumId w:val="5"/>
   </w:num>
   <w:num w:numId="14" w16cid:durableId="1064833929">
-    <w:abstractNumId w:val="18"/>
+    <w:abstractNumId w:val="19"/>
   </w:num>
   <w:num w:numId="15" w16cid:durableId="792671108">
     <w:abstractNumId w:val="4"/>
@@ -7900,7 +8105,7 @@
     <w:abstractNumId w:val="1"/>
   </w:num>
   <w:num w:numId="20" w16cid:durableId="347291366">
-    <w:abstractNumId w:val="19"/>
+    <w:abstractNumId w:val="20"/>
   </w:num>
   <w:num w:numId="21" w16cid:durableId="600457012">
     <w:abstractNumId w:val="8"/>
@@ -7909,7 +8114,10 @@
     <w:abstractNumId w:val="12"/>
   </w:num>
   <w:num w:numId="23" w16cid:durableId="369955441">
-    <w:abstractNumId w:val="17"/>
+    <w:abstractNumId w:val="18"/>
+  </w:num>
+  <w:num w:numId="24" w16cid:durableId="299775808">
+    <w:abstractNumId w:val="14"/>
   </w:num>
 </w:numbering>
 </file>

</xml_diff>

<commit_message>
Implement company profile data display
</commit_message>
<xml_diff>
--- a/tax_my_app_research_doc.docx
+++ b/tax_my_app_research_doc.docx
@@ -3813,7 +3813,7 @@
           </mc:Choice>
           <mc:Fallback>
             <w:pict>
-              <v:shapetype w14:anchorId="60111AA7" id="_x0000_t32" coordsize="21600,21600" o:spt="32" o:oned="t" path="m,l21600,21600e" filled="f">
+              <v:shapetype w14:anchorId="3717161C" id="_x0000_t32" coordsize="21600,21600" o:spt="32" o:oned="t" path="m,l21600,21600e" filled="f">
                 <v:path arrowok="t" fillok="f" o:connecttype="none"/>
                 <o:lock v:ext="edit" shapetype="t"/>
               </v:shapetype>
@@ -3895,7 +3895,7 @@
           </mc:Choice>
           <mc:Fallback>
             <w:pict>
-              <v:shape w14:anchorId="10A54AF3" id="Straight Arrow Connector 1" o:spid="_x0000_s1026" type="#_x0000_t32" style="position:absolute;margin-left:27.1pt;margin-top:.7pt;width:0;height:33.7pt;z-index:251660288;visibility:visible;mso-wrap-style:square;mso-wrap-distance-left:9pt;mso-wrap-distance-top:0;mso-wrap-distance-right:9pt;mso-wrap-distance-bottom:0;mso-position-horizontal:absolute;mso-position-horizontal-relative:text;mso-position-vertical:absolute;mso-position-vertical-relative:text" o:gfxdata="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" strokecolor="#156082 [3204]" strokeweight=".5pt">
+              <v:shape w14:anchorId="1199E539" id="Straight Arrow Connector 1" o:spid="_x0000_s1026" type="#_x0000_t32" style="position:absolute;margin-left:27.1pt;margin-top:.7pt;width:0;height:33.7pt;z-index:251660288;visibility:visible;mso-wrap-style:square;mso-wrap-distance-left:9pt;mso-wrap-distance-top:0;mso-wrap-distance-right:9pt;mso-wrap-distance-bottom:0;mso-position-horizontal:absolute;mso-position-horizontal-relative:text;mso-position-vertical:absolute;mso-position-vertical-relative:text" o:gfxdata="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" strokecolor="#156082 [3204]" strokeweight=".5pt">
                 <v:stroke endarrow="block" joinstyle="miter"/>
               </v:shape>
             </w:pict>
@@ -3975,7 +3975,7 @@
           </mc:Choice>
           <mc:Fallback>
             <w:pict>
-              <v:shape w14:anchorId="18D814B3" id="Straight Arrow Connector 1" o:spid="_x0000_s1026" type="#_x0000_t32" style="position:absolute;margin-left:73.3pt;margin-top:.4pt;width:144.65pt;height:53.5pt;z-index:251663360;visibility:visible;mso-wrap-style:square;mso-width-percent:0;mso-height-percent:0;mso-wrap-distance-left:9pt;mso-wrap-distance-top:0;mso-wrap-distance-right:9pt;mso-wrap-distance-bottom:0;mso-position-horizontal:absolute;mso-position-horizontal-relative:text;mso-position-vertical:absolute;mso-position-vertical-relative:text;mso-width-percent:0;mso-height-percent:0;mso-width-relative:margin;mso-height-relative:margin" o:gfxdata="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" strokecolor="#156082 [3204]" strokeweight=".5pt">
+              <v:shape w14:anchorId="7A1A7B94" id="Straight Arrow Connector 1" o:spid="_x0000_s1026" type="#_x0000_t32" style="position:absolute;margin-left:73.3pt;margin-top:.4pt;width:144.65pt;height:53.5pt;z-index:251663360;visibility:visible;mso-wrap-style:square;mso-width-percent:0;mso-height-percent:0;mso-wrap-distance-left:9pt;mso-wrap-distance-top:0;mso-wrap-distance-right:9pt;mso-wrap-distance-bottom:0;mso-position-horizontal:absolute;mso-position-horizontal-relative:text;mso-position-vertical:absolute;mso-position-vertical-relative:text;mso-width-percent:0;mso-height-percent:0;mso-width-relative:margin;mso-height-relative:margin" o:gfxdata="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" strokecolor="#156082 [3204]" strokeweight=".5pt">
                 <v:stroke endarrow="block" joinstyle="miter"/>
               </v:shape>
             </w:pict>
@@ -4047,7 +4047,7 @@
           </mc:Choice>
           <mc:Fallback>
             <w:pict>
-              <v:shape w14:anchorId="6AA7B17E" id="Straight Arrow Connector 1" o:spid="_x0000_s1026" type="#_x0000_t32" style="position:absolute;margin-left:49.55pt;margin-top:9pt;width:56.75pt;height:42.95pt;z-index:251662336;visibility:visible;mso-wrap-style:square;mso-width-percent:0;mso-height-percent:0;mso-wrap-distance-left:9pt;mso-wrap-distance-top:0;mso-wrap-distance-right:9pt;mso-wrap-distance-bottom:0;mso-position-horizontal:absolute;mso-position-horizontal-relative:text;mso-position-vertical:absolute;mso-position-vertical-relative:text;mso-width-percent:0;mso-height-percent:0;mso-width-relative:margin;mso-height-relative:margin" o:gfxdata="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" strokecolor="#156082 [3204]" strokeweight=".5pt">
+              <v:shape w14:anchorId="54A62BC4" id="Straight Arrow Connector 1" o:spid="_x0000_s1026" type="#_x0000_t32" style="position:absolute;margin-left:49.55pt;margin-top:9pt;width:56.75pt;height:42.95pt;z-index:251662336;visibility:visible;mso-wrap-style:square;mso-width-percent:0;mso-height-percent:0;mso-wrap-distance-left:9pt;mso-wrap-distance-top:0;mso-wrap-distance-right:9pt;mso-wrap-distance-bottom:0;mso-position-horizontal:absolute;mso-position-horizontal-relative:text;mso-position-vertical:absolute;mso-position-vertical-relative:text;mso-width-percent:0;mso-height-percent:0;mso-width-relative:margin;mso-height-relative:margin" o:gfxdata="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" strokecolor="#156082 [3204]" strokeweight=".5pt">
                 <v:stroke endarrow="block" joinstyle="miter"/>
               </v:shape>
             </w:pict>
@@ -4113,7 +4113,7 @@
           </mc:Choice>
           <mc:Fallback>
             <w:pict>
-              <v:shape w14:anchorId="71F9A4EA" id="Straight Arrow Connector 1" o:spid="_x0000_s1026" type="#_x0000_t32" style="position:absolute;margin-left:21.95pt;margin-top:12.4pt;width:0;height:33.7pt;z-index:251661312;visibility:visible;mso-wrap-style:square;mso-wrap-distance-left:9pt;mso-wrap-distance-top:0;mso-wrap-distance-right:9pt;mso-wrap-distance-bottom:0;mso-position-horizontal:absolute;mso-position-horizontal-relative:text;mso-position-vertical:absolute;mso-position-vertical-relative:text" o:gfxdata="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" strokecolor="#156082 [3204]" strokeweight=".5pt">
+              <v:shape w14:anchorId="2CFCC35D" id="Straight Arrow Connector 1" o:spid="_x0000_s1026" type="#_x0000_t32" style="position:absolute;margin-left:21.95pt;margin-top:12.4pt;width:0;height:33.7pt;z-index:251661312;visibility:visible;mso-wrap-style:square;mso-wrap-distance-left:9pt;mso-wrap-distance-top:0;mso-wrap-distance-right:9pt;mso-wrap-distance-bottom:0;mso-position-horizontal:absolute;mso-position-horizontal-relative:text;mso-position-vertical:absolute;mso-position-vertical-relative:text" o:gfxdata="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" strokecolor="#156082 [3204]" strokeweight=".5pt">
                 <v:stroke endarrow="block" joinstyle="miter"/>
               </v:shape>
             </w:pict>
@@ -4206,7 +4206,7 @@
           </mc:Choice>
           <mc:Fallback>
             <w:pict>
-              <v:shape w14:anchorId="728725B9" id="Straight Arrow Connector 1" o:spid="_x0000_s1026" type="#_x0000_t32" style="position:absolute;margin-left:25.1pt;margin-top:1.25pt;width:0;height:33.7pt;z-index:251664384;visibility:visible;mso-wrap-style:square;mso-wrap-distance-left:9pt;mso-wrap-distance-top:0;mso-wrap-distance-right:9pt;mso-wrap-distance-bottom:0;mso-position-horizontal:absolute;mso-position-horizontal-relative:text;mso-position-vertical:absolute;mso-position-vertical-relative:text" o:gfxdata="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" strokecolor="#156082 [3204]" strokeweight=".5pt">
+              <v:shape w14:anchorId="7904FB9A" id="Straight Arrow Connector 1" o:spid="_x0000_s1026" type="#_x0000_t32" style="position:absolute;margin-left:25.1pt;margin-top:1.25pt;width:0;height:33.7pt;z-index:251664384;visibility:visible;mso-wrap-style:square;mso-wrap-distance-left:9pt;mso-wrap-distance-top:0;mso-wrap-distance-right:9pt;mso-wrap-distance-bottom:0;mso-position-horizontal:absolute;mso-position-horizontal-relative:text;mso-position-vertical:absolute;mso-position-vertical-relative:text" o:gfxdata="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" strokecolor="#156082 [3204]" strokeweight=".5pt">
                 <v:stroke endarrow="block" joinstyle="miter"/>
               </v:shape>
             </w:pict>
@@ -4281,7 +4281,7 @@
           </mc:Choice>
           <mc:Fallback>
             <w:pict>
-              <v:shape w14:anchorId="12C65A1F" id="Straight Arrow Connector 1" o:spid="_x0000_s1026" type="#_x0000_t32" style="position:absolute;margin-left:25.1pt;margin-top:.65pt;width:0;height:33.7pt;z-index:251665408;visibility:visible;mso-wrap-style:square;mso-wrap-distance-left:9pt;mso-wrap-distance-top:0;mso-wrap-distance-right:9pt;mso-wrap-distance-bottom:0;mso-position-horizontal:absolute;mso-position-horizontal-relative:text;mso-position-vertical:absolute;mso-position-vertical-relative:text" o:gfxdata="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" strokecolor="#156082 [3204]" strokeweight=".5pt">
+              <v:shape w14:anchorId="339ED2D5" id="Straight Arrow Connector 1" o:spid="_x0000_s1026" type="#_x0000_t32" style="position:absolute;margin-left:25.1pt;margin-top:.65pt;width:0;height:33.7pt;z-index:251665408;visibility:visible;mso-wrap-style:square;mso-wrap-distance-left:9pt;mso-wrap-distance-top:0;mso-wrap-distance-right:9pt;mso-wrap-distance-bottom:0;mso-position-horizontal:absolute;mso-position-horizontal-relative:text;mso-position-vertical:absolute;mso-position-vertical-relative:text" o:gfxdata="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" strokecolor="#156082 [3204]" strokeweight=".5pt">
                 <v:stroke endarrow="block" joinstyle="miter"/>
               </v:shape>
             </w:pict>
@@ -4942,6 +4942,9 @@
     </w:p>
     <w:p>
       <w:r>
+        <w:rPr>
+          <w:highlight w:val="green"/>
+        </w:rPr>
         <w:t>Step 7: Authentication</w:t>
       </w:r>
     </w:p>
@@ -5060,9 +5063,144 @@
           <w:ilvl w:val="0"/>
           <w:numId w:val="24"/>
         </w:numPr>
-      </w:pPr>
-      <w:r>
+        <w:rPr>
+          <w:highlight w:val="darkGreen"/>
+        </w:rPr>
+      </w:pPr>
+      <w:r>
+        <w:rPr>
+          <w:highlight w:val="darkGreen"/>
+        </w:rPr>
         <w:t>Protect app routes</w:t>
+      </w:r>
+    </w:p>
+    <w:p/>
+    <w:p>
+      <w:r>
+        <w:rPr>
+          <w:highlight w:val="green"/>
+        </w:rPr>
+        <w:t>Step 8:  Business Data Management</w:t>
+      </w:r>
+    </w:p>
+    <w:p>
+      <w:pPr>
+        <w:pStyle w:val="ListParagraph"/>
+        <w:numPr>
+          <w:ilvl w:val="0"/>
+          <w:numId w:val="25"/>
+        </w:numPr>
+      </w:pPr>
+      <w:r>
+        <w:t>Create company interface</w:t>
+      </w:r>
+    </w:p>
+    <w:p>
+      <w:pPr>
+        <w:pStyle w:val="ListParagraph"/>
+        <w:numPr>
+          <w:ilvl w:val="0"/>
+          <w:numId w:val="25"/>
+        </w:numPr>
+      </w:pPr>
+      <w:r>
+        <w:t>Connect company form to database</w:t>
+      </w:r>
+    </w:p>
+    <w:p>
+      <w:pPr>
+        <w:pStyle w:val="ListParagraph"/>
+        <w:numPr>
+          <w:ilvl w:val="0"/>
+          <w:numId w:val="25"/>
+        </w:numPr>
+      </w:pPr>
+      <w:r>
+        <w:t>Display company information</w:t>
+      </w:r>
+    </w:p>
+    <w:p>
+      <w:r>
+        <w:lastRenderedPageBreak/>
+        <w:t>Improvisation: Instead of one user many company, its one user one company many business</w:t>
+      </w:r>
+    </w:p>
+    <w:p/>
+    <w:p>
+      <w:r>
+        <w:t>Step 9: Add business layer</w:t>
+      </w:r>
+    </w:p>
+    <w:p>
+      <w:pPr>
+        <w:pStyle w:val="ListParagraph"/>
+        <w:numPr>
+          <w:ilvl w:val="0"/>
+          <w:numId w:val="26"/>
+        </w:numPr>
+      </w:pPr>
+      <w:r>
+        <w:t>Change user:company to 1:1</w:t>
+      </w:r>
+    </w:p>
+    <w:p>
+      <w:pPr>
+        <w:pStyle w:val="ListParagraph"/>
+        <w:numPr>
+          <w:ilvl w:val="0"/>
+          <w:numId w:val="26"/>
+        </w:numPr>
+      </w:pPr>
+      <w:r>
+        <w:t>Add business model</w:t>
+      </w:r>
+    </w:p>
+    <w:p>
+      <w:pPr>
+        <w:pStyle w:val="ListParagraph"/>
+        <w:numPr>
+          <w:ilvl w:val="0"/>
+          <w:numId w:val="26"/>
+        </w:numPr>
+      </w:pPr>
+      <w:r>
+        <w:t>Edit other models classes</w:t>
+      </w:r>
+    </w:p>
+    <w:p>
+      <w:pPr>
+        <w:pStyle w:val="ListParagraph"/>
+        <w:numPr>
+          <w:ilvl w:val="0"/>
+          <w:numId w:val="26"/>
+        </w:numPr>
+      </w:pPr>
+      <w:r>
+        <w:t>Create migration</w:t>
+      </w:r>
+    </w:p>
+    <w:p>
+      <w:pPr>
+        <w:pStyle w:val="ListParagraph"/>
+        <w:numPr>
+          <w:ilvl w:val="0"/>
+          <w:numId w:val="26"/>
+        </w:numPr>
+      </w:pPr>
+      <w:r>
+        <w:t>Upgrade migration</w:t>
+      </w:r>
+    </w:p>
+    <w:p>
+      <w:pPr>
+        <w:pStyle w:val="ListParagraph"/>
+        <w:numPr>
+          <w:ilvl w:val="0"/>
+          <w:numId w:val="26"/>
+        </w:numPr>
+      </w:pPr>
+      <w:r>
+        <w:t>Make sure existing features haven’t broken</w:t>
       </w:r>
     </w:p>
     <w:sectPr>
@@ -6239,6 +6377,95 @@
     </w:lvl>
   </w:abstractNum>
   <w:abstractNum w:abstractNumId="9" w15:restartNumberingAfterBreak="0">
+    <w:nsid w:val="35DF6CF3"/>
+    <w:multiLevelType w:val="hybridMultilevel"/>
+    <w:tmpl w:val="AAAAE5B6"/>
+    <w:lvl w:ilvl="0" w:tplc="D586F020">
+      <w:start w:val="1"/>
+      <w:numFmt w:val="lowerRoman"/>
+      <w:lvlText w:val="%1."/>
+      <w:lvlJc w:val="left"/>
+      <w:pPr>
+        <w:ind w:left="1080" w:hanging="720"/>
+      </w:pPr>
+      <w:rPr>
+        <w:rFonts w:hint="default"/>
+      </w:rPr>
+    </w:lvl>
+    <w:lvl w:ilvl="1" w:tplc="18090019" w:tentative="1">
+      <w:start w:val="1"/>
+      <w:numFmt w:val="lowerLetter"/>
+      <w:lvlText w:val="%2."/>
+      <w:lvlJc w:val="left"/>
+      <w:pPr>
+        <w:ind w:left="1440" w:hanging="360"/>
+      </w:pPr>
+    </w:lvl>
+    <w:lvl w:ilvl="2" w:tplc="1809001B" w:tentative="1">
+      <w:start w:val="1"/>
+      <w:numFmt w:val="lowerRoman"/>
+      <w:lvlText w:val="%3."/>
+      <w:lvlJc w:val="right"/>
+      <w:pPr>
+        <w:ind w:left="2160" w:hanging="180"/>
+      </w:pPr>
+    </w:lvl>
+    <w:lvl w:ilvl="3" w:tplc="1809000F" w:tentative="1">
+      <w:start w:val="1"/>
+      <w:numFmt w:val="decimal"/>
+      <w:lvlText w:val="%4."/>
+      <w:lvlJc w:val="left"/>
+      <w:pPr>
+        <w:ind w:left="2880" w:hanging="360"/>
+      </w:pPr>
+    </w:lvl>
+    <w:lvl w:ilvl="4" w:tplc="18090019" w:tentative="1">
+      <w:start w:val="1"/>
+      <w:numFmt w:val="lowerLetter"/>
+      <w:lvlText w:val="%5."/>
+      <w:lvlJc w:val="left"/>
+      <w:pPr>
+        <w:ind w:left="3600" w:hanging="360"/>
+      </w:pPr>
+    </w:lvl>
+    <w:lvl w:ilvl="5" w:tplc="1809001B" w:tentative="1">
+      <w:start w:val="1"/>
+      <w:numFmt w:val="lowerRoman"/>
+      <w:lvlText w:val="%6."/>
+      <w:lvlJc w:val="right"/>
+      <w:pPr>
+        <w:ind w:left="4320" w:hanging="180"/>
+      </w:pPr>
+    </w:lvl>
+    <w:lvl w:ilvl="6" w:tplc="1809000F" w:tentative="1">
+      <w:start w:val="1"/>
+      <w:numFmt w:val="decimal"/>
+      <w:lvlText w:val="%7."/>
+      <w:lvlJc w:val="left"/>
+      <w:pPr>
+        <w:ind w:left="5040" w:hanging="360"/>
+      </w:pPr>
+    </w:lvl>
+    <w:lvl w:ilvl="7" w:tplc="18090019" w:tentative="1">
+      <w:start w:val="1"/>
+      <w:numFmt w:val="lowerLetter"/>
+      <w:lvlText w:val="%8."/>
+      <w:lvlJc w:val="left"/>
+      <w:pPr>
+        <w:ind w:left="5760" w:hanging="360"/>
+      </w:pPr>
+    </w:lvl>
+    <w:lvl w:ilvl="8" w:tplc="1809001B" w:tentative="1">
+      <w:start w:val="1"/>
+      <w:numFmt w:val="lowerRoman"/>
+      <w:lvlText w:val="%9."/>
+      <w:lvlJc w:val="right"/>
+      <w:pPr>
+        <w:ind w:left="6480" w:hanging="180"/>
+      </w:pPr>
+    </w:lvl>
+  </w:abstractNum>
+  <w:abstractNum w:abstractNumId="10" w15:restartNumberingAfterBreak="0">
     <w:nsid w:val="37E752BE"/>
     <w:multiLevelType w:val="hybridMultilevel"/>
     <w:tmpl w:val="E830FAF0"/>
@@ -6327,7 +6554,7 @@
       </w:pPr>
     </w:lvl>
   </w:abstractNum>
-  <w:abstractNum w:abstractNumId="10" w15:restartNumberingAfterBreak="0">
+  <w:abstractNum w:abstractNumId="11" w15:restartNumberingAfterBreak="0">
     <w:nsid w:val="39646A35"/>
     <w:multiLevelType w:val="multilevel"/>
     <w:tmpl w:val="8E500126"/>
@@ -6476,7 +6703,7 @@
       </w:rPr>
     </w:lvl>
   </w:abstractNum>
-  <w:abstractNum w:abstractNumId="11" w15:restartNumberingAfterBreak="0">
+  <w:abstractNum w:abstractNumId="12" w15:restartNumberingAfterBreak="0">
     <w:nsid w:val="3976333D"/>
     <w:multiLevelType w:val="multilevel"/>
     <w:tmpl w:val="E0CC86D6"/>
@@ -6625,7 +6852,7 @@
       </w:rPr>
     </w:lvl>
   </w:abstractNum>
-  <w:abstractNum w:abstractNumId="12" w15:restartNumberingAfterBreak="0">
+  <w:abstractNum w:abstractNumId="13" w15:restartNumberingAfterBreak="0">
     <w:nsid w:val="3C513991"/>
     <w:multiLevelType w:val="multilevel"/>
     <w:tmpl w:val="671C2216"/>
@@ -6774,7 +7001,7 @@
       </w:rPr>
     </w:lvl>
   </w:abstractNum>
-  <w:abstractNum w:abstractNumId="13" w15:restartNumberingAfterBreak="0">
+  <w:abstractNum w:abstractNumId="14" w15:restartNumberingAfterBreak="0">
     <w:nsid w:val="3E6C6813"/>
     <w:multiLevelType w:val="hybridMultilevel"/>
     <w:tmpl w:val="97EA87D2"/>
@@ -6887,7 +7114,7 @@
       </w:rPr>
     </w:lvl>
   </w:abstractNum>
-  <w:abstractNum w:abstractNumId="14" w15:restartNumberingAfterBreak="0">
+  <w:abstractNum w:abstractNumId="15" w15:restartNumberingAfterBreak="0">
     <w:nsid w:val="444971F6"/>
     <w:multiLevelType w:val="hybridMultilevel"/>
     <w:tmpl w:val="E1E6ED50"/>
@@ -6976,7 +7203,7 @@
       </w:pPr>
     </w:lvl>
   </w:abstractNum>
-  <w:abstractNum w:abstractNumId="15" w15:restartNumberingAfterBreak="0">
+  <w:abstractNum w:abstractNumId="16" w15:restartNumberingAfterBreak="0">
     <w:nsid w:val="4AAB35E7"/>
     <w:multiLevelType w:val="hybridMultilevel"/>
     <w:tmpl w:val="33468086"/>
@@ -7065,7 +7292,7 @@
       </w:pPr>
     </w:lvl>
   </w:abstractNum>
-  <w:abstractNum w:abstractNumId="16" w15:restartNumberingAfterBreak="0">
+  <w:abstractNum w:abstractNumId="17" w15:restartNumberingAfterBreak="0">
     <w:nsid w:val="55C351DD"/>
     <w:multiLevelType w:val="hybridMultilevel"/>
     <w:tmpl w:val="4AEE18A8"/>
@@ -7177,7 +7404,7 @@
       </w:rPr>
     </w:lvl>
   </w:abstractNum>
-  <w:abstractNum w:abstractNumId="17" w15:restartNumberingAfterBreak="0">
+  <w:abstractNum w:abstractNumId="18" w15:restartNumberingAfterBreak="0">
     <w:nsid w:val="57F04BA7"/>
     <w:multiLevelType w:val="hybridMultilevel"/>
     <w:tmpl w:val="89FAC4E8"/>
@@ -7289,7 +7516,7 @@
       </w:rPr>
     </w:lvl>
   </w:abstractNum>
-  <w:abstractNum w:abstractNumId="18" w15:restartNumberingAfterBreak="0">
+  <w:abstractNum w:abstractNumId="19" w15:restartNumberingAfterBreak="0">
     <w:nsid w:val="5CF55B61"/>
     <w:multiLevelType w:val="multilevel"/>
     <w:tmpl w:val="E83007CA"/>
@@ -7402,7 +7629,7 @@
       </w:pPr>
     </w:lvl>
   </w:abstractNum>
-  <w:abstractNum w:abstractNumId="19" w15:restartNumberingAfterBreak="0">
+  <w:abstractNum w:abstractNumId="20" w15:restartNumberingAfterBreak="0">
     <w:nsid w:val="5F517807"/>
     <w:multiLevelType w:val="multilevel"/>
     <w:tmpl w:val="D6483B3A"/>
@@ -7551,7 +7778,7 @@
       </w:rPr>
     </w:lvl>
   </w:abstractNum>
-  <w:abstractNum w:abstractNumId="20" w15:restartNumberingAfterBreak="0">
+  <w:abstractNum w:abstractNumId="21" w15:restartNumberingAfterBreak="0">
     <w:nsid w:val="66435C03"/>
     <w:multiLevelType w:val="multilevel"/>
     <w:tmpl w:val="6472C53C"/>
@@ -7696,7 +7923,7 @@
       </w:rPr>
     </w:lvl>
   </w:abstractNum>
-  <w:abstractNum w:abstractNumId="21" w15:restartNumberingAfterBreak="0">
+  <w:abstractNum w:abstractNumId="22" w15:restartNumberingAfterBreak="0">
     <w:nsid w:val="6BDE049C"/>
     <w:multiLevelType w:val="hybridMultilevel"/>
     <w:tmpl w:val="BF82618A"/>
@@ -7785,7 +8012,7 @@
       </w:pPr>
     </w:lvl>
   </w:abstractNum>
-  <w:abstractNum w:abstractNumId="22" w15:restartNumberingAfterBreak="0">
+  <w:abstractNum w:abstractNumId="23" w15:restartNumberingAfterBreak="0">
     <w:nsid w:val="6C374FE2"/>
     <w:multiLevelType w:val="hybridMultilevel"/>
     <w:tmpl w:val="63CE2C92"/>
@@ -7898,7 +8125,7 @@
       </w:rPr>
     </w:lvl>
   </w:abstractNum>
-  <w:abstractNum w:abstractNumId="23" w15:restartNumberingAfterBreak="0">
+  <w:abstractNum w:abstractNumId="24" w15:restartNumberingAfterBreak="0">
     <w:nsid w:val="6D0A6477"/>
     <w:multiLevelType w:val="multilevel"/>
     <w:tmpl w:val="088E7932"/>
@@ -8047,38 +8274,127 @@
       </w:rPr>
     </w:lvl>
   </w:abstractNum>
+  <w:abstractNum w:abstractNumId="25" w15:restartNumberingAfterBreak="0">
+    <w:nsid w:val="72B83DC1"/>
+    <w:multiLevelType w:val="hybridMultilevel"/>
+    <w:tmpl w:val="EA64A0D8"/>
+    <w:lvl w:ilvl="0" w:tplc="22321F94">
+      <w:start w:val="1"/>
+      <w:numFmt w:val="lowerRoman"/>
+      <w:lvlText w:val="%1."/>
+      <w:lvlJc w:val="left"/>
+      <w:pPr>
+        <w:ind w:left="1080" w:hanging="720"/>
+      </w:pPr>
+      <w:rPr>
+        <w:rFonts w:hint="default"/>
+      </w:rPr>
+    </w:lvl>
+    <w:lvl w:ilvl="1" w:tplc="18090019" w:tentative="1">
+      <w:start w:val="1"/>
+      <w:numFmt w:val="lowerLetter"/>
+      <w:lvlText w:val="%2."/>
+      <w:lvlJc w:val="left"/>
+      <w:pPr>
+        <w:ind w:left="1440" w:hanging="360"/>
+      </w:pPr>
+    </w:lvl>
+    <w:lvl w:ilvl="2" w:tplc="1809001B" w:tentative="1">
+      <w:start w:val="1"/>
+      <w:numFmt w:val="lowerRoman"/>
+      <w:lvlText w:val="%3."/>
+      <w:lvlJc w:val="right"/>
+      <w:pPr>
+        <w:ind w:left="2160" w:hanging="180"/>
+      </w:pPr>
+    </w:lvl>
+    <w:lvl w:ilvl="3" w:tplc="1809000F" w:tentative="1">
+      <w:start w:val="1"/>
+      <w:numFmt w:val="decimal"/>
+      <w:lvlText w:val="%4."/>
+      <w:lvlJc w:val="left"/>
+      <w:pPr>
+        <w:ind w:left="2880" w:hanging="360"/>
+      </w:pPr>
+    </w:lvl>
+    <w:lvl w:ilvl="4" w:tplc="18090019" w:tentative="1">
+      <w:start w:val="1"/>
+      <w:numFmt w:val="lowerLetter"/>
+      <w:lvlText w:val="%5."/>
+      <w:lvlJc w:val="left"/>
+      <w:pPr>
+        <w:ind w:left="3600" w:hanging="360"/>
+      </w:pPr>
+    </w:lvl>
+    <w:lvl w:ilvl="5" w:tplc="1809001B" w:tentative="1">
+      <w:start w:val="1"/>
+      <w:numFmt w:val="lowerRoman"/>
+      <w:lvlText w:val="%6."/>
+      <w:lvlJc w:val="right"/>
+      <w:pPr>
+        <w:ind w:left="4320" w:hanging="180"/>
+      </w:pPr>
+    </w:lvl>
+    <w:lvl w:ilvl="6" w:tplc="1809000F" w:tentative="1">
+      <w:start w:val="1"/>
+      <w:numFmt w:val="decimal"/>
+      <w:lvlText w:val="%7."/>
+      <w:lvlJc w:val="left"/>
+      <w:pPr>
+        <w:ind w:left="5040" w:hanging="360"/>
+      </w:pPr>
+    </w:lvl>
+    <w:lvl w:ilvl="7" w:tplc="18090019" w:tentative="1">
+      <w:start w:val="1"/>
+      <w:numFmt w:val="lowerLetter"/>
+      <w:lvlText w:val="%8."/>
+      <w:lvlJc w:val="left"/>
+      <w:pPr>
+        <w:ind w:left="5760" w:hanging="360"/>
+      </w:pPr>
+    </w:lvl>
+    <w:lvl w:ilvl="8" w:tplc="1809001B" w:tentative="1">
+      <w:start w:val="1"/>
+      <w:numFmt w:val="lowerRoman"/>
+      <w:lvlText w:val="%9."/>
+      <w:lvlJc w:val="right"/>
+      <w:pPr>
+        <w:ind w:left="6480" w:hanging="180"/>
+      </w:pPr>
+    </w:lvl>
+  </w:abstractNum>
   <w:num w:numId="1" w16cid:durableId="687365248">
-    <w:abstractNumId w:val="17"/>
+    <w:abstractNumId w:val="18"/>
   </w:num>
   <w:num w:numId="2" w16cid:durableId="217130696">
-    <w:abstractNumId w:val="16"/>
+    <w:abstractNumId w:val="17"/>
   </w:num>
   <w:num w:numId="3" w16cid:durableId="1326470716">
     <w:abstractNumId w:val="0"/>
   </w:num>
   <w:num w:numId="4" w16cid:durableId="820778064">
-    <w:abstractNumId w:val="9"/>
+    <w:abstractNumId w:val="10"/>
   </w:num>
   <w:num w:numId="5" w16cid:durableId="1098409054">
-    <w:abstractNumId w:val="22"/>
+    <w:abstractNumId w:val="23"/>
   </w:num>
   <w:num w:numId="6" w16cid:durableId="444812254">
     <w:abstractNumId w:val="2"/>
   </w:num>
   <w:num w:numId="7" w16cid:durableId="128133453">
-    <w:abstractNumId w:val="13"/>
+    <w:abstractNumId w:val="14"/>
   </w:num>
   <w:num w:numId="8" w16cid:durableId="934286284">
-    <w:abstractNumId w:val="21"/>
+    <w:abstractNumId w:val="22"/>
   </w:num>
   <w:num w:numId="9" w16cid:durableId="2068608718">
-    <w:abstractNumId w:val="15"/>
+    <w:abstractNumId w:val="16"/>
   </w:num>
   <w:num w:numId="10" w16cid:durableId="302345709">
     <w:abstractNumId w:val="3"/>
   </w:num>
   <w:num w:numId="11" w16cid:durableId="200896949">
-    <w:abstractNumId w:val="23"/>
+    <w:abstractNumId w:val="24"/>
   </w:num>
   <w:num w:numId="12" w16cid:durableId="643777150">
     <w:abstractNumId w:val="6"/>
@@ -8087,16 +8403,16 @@
     <w:abstractNumId w:val="5"/>
   </w:num>
   <w:num w:numId="14" w16cid:durableId="1064833929">
-    <w:abstractNumId w:val="19"/>
+    <w:abstractNumId w:val="20"/>
   </w:num>
   <w:num w:numId="15" w16cid:durableId="792671108">
     <w:abstractNumId w:val="4"/>
   </w:num>
   <w:num w:numId="16" w16cid:durableId="468061370">
-    <w:abstractNumId w:val="11"/>
+    <w:abstractNumId w:val="12"/>
   </w:num>
   <w:num w:numId="17" w16cid:durableId="1039819233">
-    <w:abstractNumId w:val="10"/>
+    <w:abstractNumId w:val="11"/>
   </w:num>
   <w:num w:numId="18" w16cid:durableId="1844784502">
     <w:abstractNumId w:val="7"/>
@@ -8105,19 +8421,25 @@
     <w:abstractNumId w:val="1"/>
   </w:num>
   <w:num w:numId="20" w16cid:durableId="347291366">
-    <w:abstractNumId w:val="20"/>
+    <w:abstractNumId w:val="21"/>
   </w:num>
   <w:num w:numId="21" w16cid:durableId="600457012">
     <w:abstractNumId w:val="8"/>
   </w:num>
   <w:num w:numId="22" w16cid:durableId="333848017">
-    <w:abstractNumId w:val="12"/>
+    <w:abstractNumId w:val="13"/>
   </w:num>
   <w:num w:numId="23" w16cid:durableId="369955441">
-    <w:abstractNumId w:val="18"/>
+    <w:abstractNumId w:val="19"/>
   </w:num>
   <w:num w:numId="24" w16cid:durableId="299775808">
-    <w:abstractNumId w:val="14"/>
+    <w:abstractNumId w:val="15"/>
+  </w:num>
+  <w:num w:numId="25" w16cid:durableId="410465949">
+    <w:abstractNumId w:val="9"/>
+  </w:num>
+  <w:num w:numId="26" w16cid:durableId="1923172550">
+    <w:abstractNumId w:val="25"/>
   </w:num>
 </w:numbering>
 </file>

</xml_diff>

<commit_message>
Implement business management CRUD
</commit_message>
<xml_diff>
--- a/tax_my_app_research_doc.docx
+++ b/tax_my_app_research_doc.docx
@@ -1,6 +1,6 @@
 
 <file path=word/document.xml><?xml version="1.0" encoding="utf-8"?>
-<w:document xmlns:wpc="http://schemas.microsoft.com/office/word/2010/wordprocessingCanvas" xmlns:cx="http://schemas.microsoft.com/office/drawing/2014/chartex" xmlns:cx1="http://schemas.microsoft.com/office/drawing/2015/9/8/chartex" xmlns:cx2="http://schemas.microsoft.com/office/drawing/2015/10/21/chartex" xmlns:cx3="http://schemas.microsoft.com/office/drawing/2016/5/9/chartex" xmlns:cx4="http://schemas.microsoft.com/office/drawing/2016/5/10/chartex" xmlns:cx5="http://schemas.microsoft.com/office/drawing/2016/5/11/chartex" xmlns:cx6="http://schemas.microsoft.com/office/drawing/2016/5/12/chartex" xmlns:cx7="http://schemas.microsoft.com/office/drawing/2016/5/13/chartex" xmlns:cx8="http://schemas.microsoft.com/office/drawing/2016/5/14/chartex" xmlns:mc="http://schemas.openxmlformats.org/markup-compatibility/2006" xmlns:aink="http://schemas.microsoft.com/office/drawing/2016/ink" xmlns:am3d="http://schemas.microsoft.com/office/drawing/2017/model3d" xmlns:o="urn:schemas-microsoft-com:office:office" xmlns:oel="http://schemas.microsoft.com/office/2019/extlst" xmlns:r="http://schemas.openxmlformats.org/officeDocument/2006/relationships" xmlns:m="http://schemas.openxmlformats.org/officeDocument/2006/math" xmlns:v="urn:schemas-microsoft-com:vml" xmlns:wp14="http://schemas.microsoft.com/office/word/2010/wordprocessingDrawing" xmlns:wp="http://schemas.openxmlformats.org/drawingml/2006/wordprocessingDrawing" xmlns:w10="urn:schemas-microsoft-com:office:word" xmlns:w="http://schemas.openxmlformats.org/wordprocessingml/2006/main" xmlns:w14="http://schemas.microsoft.com/office/word/2010/wordml" xmlns:w15="http://schemas.microsoft.com/office/word/2012/wordml" xmlns:w16cei="http://schemas.microsoft.com/office/word/2026/wordml/cei" xmlns:w16cex="http://schemas.microsoft.com/office/word/2018/wordml/cex" xmlns:w16cid="http://schemas.microsoft.com/office/word/2016/wordml/cid" xmlns:w16="http://schemas.microsoft.com/office/word/2018/wordml" xmlns:w16du="http://schemas.microsoft.com/office/word/2023/wordml/word16du" xmlns:w16sdtdh="http://schemas.microsoft.com/office/word/2020/wordml/sdtdatahash" xmlns:w16sdtfl="http://schemas.microsoft.com/office/word/2024/wordml/sdtformatlock" xmlns:w16se="http://schemas.microsoft.com/office/word/2015/wordml/symex" xmlns:wpg="http://schemas.microsoft.com/office/word/2010/wordprocessingGroup" xmlns:wpi="http://schemas.microsoft.com/office/word/2010/wordprocessingInk" xmlns:wne="http://schemas.microsoft.com/office/word/2006/wordml" xmlns:wps="http://schemas.microsoft.com/office/word/2010/wordprocessingShape" mc:Ignorable="w14 w15 w16se w16cid w16 w16cex w16sdtdh w16sdtfl w16du wp14">
+<w:document xmlns:wpc="http://schemas.microsoft.com/office/word/2010/wordprocessingCanvas" xmlns:cx="http://schemas.microsoft.com/office/drawing/2014/chartex" xmlns:cx1="http://schemas.microsoft.com/office/drawing/2015/9/8/chartex" xmlns:cx2="http://schemas.microsoft.com/office/drawing/2015/10/21/chartex" xmlns:cx3="http://schemas.microsoft.com/office/drawing/2016/5/9/chartex" xmlns:cx4="http://schemas.microsoft.com/office/drawing/2016/5/10/chartex" xmlns:cx5="http://schemas.microsoft.com/office/drawing/2016/5/11/chartex" xmlns:cx6="http://schemas.microsoft.com/office/drawing/2016/5/12/chartex" xmlns:cx7="http://schemas.microsoft.com/office/drawing/2016/5/13/chartex" xmlns:cx8="http://schemas.microsoft.com/office/drawing/2016/5/14/chartex" xmlns:mc="http://schemas.openxmlformats.org/markup-compatibility/2006" xmlns:aink="http://schemas.microsoft.com/office/drawing/2016/ink" xmlns:am3d="http://schemas.microsoft.com/office/drawing/2017/model3d" xmlns:o="urn:schemas-microsoft-com:office:office" xmlns:oel="http://schemas.microsoft.com/office/2019/extlst" xmlns:r="http://schemas.openxmlformats.org/officeDocument/2006/relationships" xmlns:m="http://schemas.openxmlformats.org/officeDocument/2006/math" xmlns:v="urn:schemas-microsoft-com:vml" xmlns:wp14="http://schemas.microsoft.com/office/word/2010/wordprocessingDrawing" xmlns:wp="http://schemas.openxmlformats.org/drawingml/2006/wordprocessingDrawing" xmlns:w10="urn:schemas-microsoft-com:office:word" xmlns:w="http://schemas.openxmlformats.org/wordprocessingml/2006/main" xmlns:w14="http://schemas.microsoft.com/office/word/2010/wordml" xmlns:w15="http://schemas.microsoft.com/office/word/2012/wordml" xmlns:w16cex="http://schemas.microsoft.com/office/word/2018/wordml/cex" xmlns:w16cid="http://schemas.microsoft.com/office/word/2016/wordml/cid" xmlns:w16="http://schemas.microsoft.com/office/word/2018/wordml" xmlns:w16du="http://schemas.microsoft.com/office/word/2023/wordml/word16du" xmlns:w16sdtdh="http://schemas.microsoft.com/office/word/2020/wordml/sdtdatahash" xmlns:w16sdtfl="http://schemas.microsoft.com/office/word/2024/wordml/sdtformatlock" xmlns:w16se="http://schemas.microsoft.com/office/word/2015/wordml/symex" xmlns:wpg="http://schemas.microsoft.com/office/word/2010/wordprocessingGroup" xmlns:wpi="http://schemas.microsoft.com/office/word/2010/wordprocessingInk" xmlns:wne="http://schemas.microsoft.com/office/word/2006/wordml" xmlns:wps="http://schemas.microsoft.com/office/word/2010/wordprocessingShape" mc:Ignorable="w14 w15 w16se w16cid w16 w16cex w16sdtdh w16sdtfl w16du wp14">
   <w:body>
     <w:p>
       <w:r>
@@ -3813,7 +3813,7 @@
           </mc:Choice>
           <mc:Fallback>
             <w:pict>
-              <v:shapetype w14:anchorId="3717161C" id="_x0000_t32" coordsize="21600,21600" o:spt="32" o:oned="t" path="m,l21600,21600e" filled="f">
+              <v:shapetype w14:anchorId="3DB08F00" id="_x0000_t32" coordsize="21600,21600" o:spt="32" o:oned="t" path="m,l21600,21600e" filled="f">
                 <v:path arrowok="t" fillok="f" o:connecttype="none"/>
                 <o:lock v:ext="edit" shapetype="t"/>
               </v:shapetype>
@@ -3895,7 +3895,7 @@
           </mc:Choice>
           <mc:Fallback>
             <w:pict>
-              <v:shape w14:anchorId="1199E539" id="Straight Arrow Connector 1" o:spid="_x0000_s1026" type="#_x0000_t32" style="position:absolute;margin-left:27.1pt;margin-top:.7pt;width:0;height:33.7pt;z-index:251660288;visibility:visible;mso-wrap-style:square;mso-wrap-distance-left:9pt;mso-wrap-distance-top:0;mso-wrap-distance-right:9pt;mso-wrap-distance-bottom:0;mso-position-horizontal:absolute;mso-position-horizontal-relative:text;mso-position-vertical:absolute;mso-position-vertical-relative:text" o:gfxdata="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" strokecolor="#156082 [3204]" strokeweight=".5pt">
+              <v:shape w14:anchorId="0FE20B70" id="Straight Arrow Connector 1" o:spid="_x0000_s1026" type="#_x0000_t32" style="position:absolute;margin-left:27.1pt;margin-top:.7pt;width:0;height:33.7pt;z-index:251660288;visibility:visible;mso-wrap-style:square;mso-wrap-distance-left:9pt;mso-wrap-distance-top:0;mso-wrap-distance-right:9pt;mso-wrap-distance-bottom:0;mso-position-horizontal:absolute;mso-position-horizontal-relative:text;mso-position-vertical:absolute;mso-position-vertical-relative:text" o:gfxdata="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" strokecolor="#156082 [3204]" strokeweight=".5pt">
                 <v:stroke endarrow="block" joinstyle="miter"/>
               </v:shape>
             </w:pict>
@@ -3975,7 +3975,7 @@
           </mc:Choice>
           <mc:Fallback>
             <w:pict>
-              <v:shape w14:anchorId="7A1A7B94" id="Straight Arrow Connector 1" o:spid="_x0000_s1026" type="#_x0000_t32" style="position:absolute;margin-left:73.3pt;margin-top:.4pt;width:144.65pt;height:53.5pt;z-index:251663360;visibility:visible;mso-wrap-style:square;mso-width-percent:0;mso-height-percent:0;mso-wrap-distance-left:9pt;mso-wrap-distance-top:0;mso-wrap-distance-right:9pt;mso-wrap-distance-bottom:0;mso-position-horizontal:absolute;mso-position-horizontal-relative:text;mso-position-vertical:absolute;mso-position-vertical-relative:text;mso-width-percent:0;mso-height-percent:0;mso-width-relative:margin;mso-height-relative:margin" o:gfxdata="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" strokecolor="#156082 [3204]" strokeweight=".5pt">
+              <v:shape w14:anchorId="120E0A42" id="Straight Arrow Connector 1" o:spid="_x0000_s1026" type="#_x0000_t32" style="position:absolute;margin-left:73.3pt;margin-top:.4pt;width:144.65pt;height:53.5pt;z-index:251663360;visibility:visible;mso-wrap-style:square;mso-width-percent:0;mso-height-percent:0;mso-wrap-distance-left:9pt;mso-wrap-distance-top:0;mso-wrap-distance-right:9pt;mso-wrap-distance-bottom:0;mso-position-horizontal:absolute;mso-position-horizontal-relative:text;mso-position-vertical:absolute;mso-position-vertical-relative:text;mso-width-percent:0;mso-height-percent:0;mso-width-relative:margin;mso-height-relative:margin" o:gfxdata="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" strokecolor="#156082 [3204]" strokeweight=".5pt">
                 <v:stroke endarrow="block" joinstyle="miter"/>
               </v:shape>
             </w:pict>
@@ -4047,7 +4047,7 @@
           </mc:Choice>
           <mc:Fallback>
             <w:pict>
-              <v:shape w14:anchorId="54A62BC4" id="Straight Arrow Connector 1" o:spid="_x0000_s1026" type="#_x0000_t32" style="position:absolute;margin-left:49.55pt;margin-top:9pt;width:56.75pt;height:42.95pt;z-index:251662336;visibility:visible;mso-wrap-style:square;mso-width-percent:0;mso-height-percent:0;mso-wrap-distance-left:9pt;mso-wrap-distance-top:0;mso-wrap-distance-right:9pt;mso-wrap-distance-bottom:0;mso-position-horizontal:absolute;mso-position-horizontal-relative:text;mso-position-vertical:absolute;mso-position-vertical-relative:text;mso-width-percent:0;mso-height-percent:0;mso-width-relative:margin;mso-height-relative:margin" o:gfxdata="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" strokecolor="#156082 [3204]" strokeweight=".5pt">
+              <v:shape w14:anchorId="07063744" id="Straight Arrow Connector 1" o:spid="_x0000_s1026" type="#_x0000_t32" style="position:absolute;margin-left:49.55pt;margin-top:9pt;width:56.75pt;height:42.95pt;z-index:251662336;visibility:visible;mso-wrap-style:square;mso-width-percent:0;mso-height-percent:0;mso-wrap-distance-left:9pt;mso-wrap-distance-top:0;mso-wrap-distance-right:9pt;mso-wrap-distance-bottom:0;mso-position-horizontal:absolute;mso-position-horizontal-relative:text;mso-position-vertical:absolute;mso-position-vertical-relative:text;mso-width-percent:0;mso-height-percent:0;mso-width-relative:margin;mso-height-relative:margin" o:gfxdata="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" strokecolor="#156082 [3204]" strokeweight=".5pt">
                 <v:stroke endarrow="block" joinstyle="miter"/>
               </v:shape>
             </w:pict>
@@ -4113,7 +4113,7 @@
           </mc:Choice>
           <mc:Fallback>
             <w:pict>
-              <v:shape w14:anchorId="2CFCC35D" id="Straight Arrow Connector 1" o:spid="_x0000_s1026" type="#_x0000_t32" style="position:absolute;margin-left:21.95pt;margin-top:12.4pt;width:0;height:33.7pt;z-index:251661312;visibility:visible;mso-wrap-style:square;mso-wrap-distance-left:9pt;mso-wrap-distance-top:0;mso-wrap-distance-right:9pt;mso-wrap-distance-bottom:0;mso-position-horizontal:absolute;mso-position-horizontal-relative:text;mso-position-vertical:absolute;mso-position-vertical-relative:text" o:gfxdata="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" strokecolor="#156082 [3204]" strokeweight=".5pt">
+              <v:shape w14:anchorId="003C665C" id="Straight Arrow Connector 1" o:spid="_x0000_s1026" type="#_x0000_t32" style="position:absolute;margin-left:21.95pt;margin-top:12.4pt;width:0;height:33.7pt;z-index:251661312;visibility:visible;mso-wrap-style:square;mso-wrap-distance-left:9pt;mso-wrap-distance-top:0;mso-wrap-distance-right:9pt;mso-wrap-distance-bottom:0;mso-position-horizontal:absolute;mso-position-horizontal-relative:text;mso-position-vertical:absolute;mso-position-vertical-relative:text" o:gfxdata="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" strokecolor="#156082 [3204]" strokeweight=".5pt">
                 <v:stroke endarrow="block" joinstyle="miter"/>
               </v:shape>
             </w:pict>
@@ -4206,7 +4206,7 @@
           </mc:Choice>
           <mc:Fallback>
             <w:pict>
-              <v:shape w14:anchorId="7904FB9A" id="Straight Arrow Connector 1" o:spid="_x0000_s1026" type="#_x0000_t32" style="position:absolute;margin-left:25.1pt;margin-top:1.25pt;width:0;height:33.7pt;z-index:251664384;visibility:visible;mso-wrap-style:square;mso-wrap-distance-left:9pt;mso-wrap-distance-top:0;mso-wrap-distance-right:9pt;mso-wrap-distance-bottom:0;mso-position-horizontal:absolute;mso-position-horizontal-relative:text;mso-position-vertical:absolute;mso-position-vertical-relative:text" o:gfxdata="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" strokecolor="#156082 [3204]" strokeweight=".5pt">
+              <v:shape w14:anchorId="2DD320F4" id="Straight Arrow Connector 1" o:spid="_x0000_s1026" type="#_x0000_t32" style="position:absolute;margin-left:25.1pt;margin-top:1.25pt;width:0;height:33.7pt;z-index:251664384;visibility:visible;mso-wrap-style:square;mso-wrap-distance-left:9pt;mso-wrap-distance-top:0;mso-wrap-distance-right:9pt;mso-wrap-distance-bottom:0;mso-position-horizontal:absolute;mso-position-horizontal-relative:text;mso-position-vertical:absolute;mso-position-vertical-relative:text" o:gfxdata="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" strokecolor="#156082 [3204]" strokeweight=".5pt">
                 <v:stroke endarrow="block" joinstyle="miter"/>
               </v:shape>
             </w:pict>
@@ -4281,7 +4281,7 @@
           </mc:Choice>
           <mc:Fallback>
             <w:pict>
-              <v:shape w14:anchorId="339ED2D5" id="Straight Arrow Connector 1" o:spid="_x0000_s1026" type="#_x0000_t32" style="position:absolute;margin-left:25.1pt;margin-top:.65pt;width:0;height:33.7pt;z-index:251665408;visibility:visible;mso-wrap-style:square;mso-wrap-distance-left:9pt;mso-wrap-distance-top:0;mso-wrap-distance-right:9pt;mso-wrap-distance-bottom:0;mso-position-horizontal:absolute;mso-position-horizontal-relative:text;mso-position-vertical:absolute;mso-position-vertical-relative:text" o:gfxdata="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" strokecolor="#156082 [3204]" strokeweight=".5pt">
+              <v:shape w14:anchorId="47EA95BC" id="Straight Arrow Connector 1" o:spid="_x0000_s1026" type="#_x0000_t32" style="position:absolute;margin-left:25.1pt;margin-top:.65pt;width:0;height:33.7pt;z-index:251665408;visibility:visible;mso-wrap-style:square;mso-wrap-distance-left:9pt;mso-wrap-distance-top:0;mso-wrap-distance-right:9pt;mso-wrap-distance-bottom:0;mso-position-horizontal:absolute;mso-position-horizontal-relative:text;mso-position-vertical:absolute;mso-position-vertical-relative:text" o:gfxdata="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" strokecolor="#156082 [3204]" strokeweight=".5pt">
                 <v:stroke endarrow="block" joinstyle="miter"/>
               </v:shape>
             </w:pict>
@@ -5128,6 +5128,9 @@
     <w:p/>
     <w:p>
       <w:r>
+        <w:rPr>
+          <w:highlight w:val="green"/>
+        </w:rPr>
         <w:t>Step 9: Add business layer</w:t>
       </w:r>
     </w:p>
@@ -5201,6 +5204,33 @@
       </w:pPr>
       <w:r>
         <w:t>Make sure existing features haven’t broken</w:t>
+      </w:r>
+    </w:p>
+    <w:p/>
+    <w:p>
+      <w:r>
+        <w:rPr>
+          <w:highlight w:val="green"/>
+        </w:rPr>
+        <w:t>Step 10: Company Profile route</w:t>
+      </w:r>
+    </w:p>
+    <w:p>
+      <w:r>
+        <w:rPr>
+          <w:highlight w:val="green"/>
+        </w:rPr>
+        <w:t>Step 11: Company profile webpage</w:t>
+      </w:r>
+    </w:p>
+    <w:p>
+      <w:r>
+        <w:t>Step 12: Business display</w:t>
+      </w:r>
+    </w:p>
+    <w:p>
+      <w:r>
+        <w:t>Step 13: Business creation/editing</w:t>
       </w:r>
     </w:p>
     <w:sectPr>
@@ -5214,7 +5244,7 @@
 </file>
 
 <file path=word/numbering.xml><?xml version="1.0" encoding="utf-8"?>
-<w:numbering xmlns:wpc="http://schemas.microsoft.com/office/word/2010/wordprocessingCanvas" xmlns:cx="http://schemas.microsoft.com/office/drawing/2014/chartex" xmlns:cx1="http://schemas.microsoft.com/office/drawing/2015/9/8/chartex" xmlns:cx2="http://schemas.microsoft.com/office/drawing/2015/10/21/chartex" xmlns:cx3="http://schemas.microsoft.com/office/drawing/2016/5/9/chartex" xmlns:cx4="http://schemas.microsoft.com/office/drawing/2016/5/10/chartex" xmlns:cx5="http://schemas.microsoft.com/office/drawing/2016/5/11/chartex" xmlns:cx6="http://schemas.microsoft.com/office/drawing/2016/5/12/chartex" xmlns:cx7="http://schemas.microsoft.com/office/drawing/2016/5/13/chartex" xmlns:cx8="http://schemas.microsoft.com/office/drawing/2016/5/14/chartex" xmlns:mc="http://schemas.openxmlformats.org/markup-compatibility/2006" xmlns:aink="http://schemas.microsoft.com/office/drawing/2016/ink" xmlns:am3d="http://schemas.microsoft.com/office/drawing/2017/model3d" xmlns:o="urn:schemas-microsoft-com:office:office" xmlns:oel="http://schemas.microsoft.com/office/2019/extlst" xmlns:r="http://schemas.openxmlformats.org/officeDocument/2006/relationships" xmlns:m="http://schemas.openxmlformats.org/officeDocument/2006/math" xmlns:v="urn:schemas-microsoft-com:vml" xmlns:wp14="http://schemas.microsoft.com/office/word/2010/wordprocessingDrawing" xmlns:wp="http://schemas.openxmlformats.org/drawingml/2006/wordprocessingDrawing" xmlns:w10="urn:schemas-microsoft-com:office:word" xmlns:w="http://schemas.openxmlformats.org/wordprocessingml/2006/main" xmlns:w14="http://schemas.microsoft.com/office/word/2010/wordml" xmlns:w15="http://schemas.microsoft.com/office/word/2012/wordml" xmlns:w16cei="http://schemas.microsoft.com/office/word/2026/wordml/cei" xmlns:w16cex="http://schemas.microsoft.com/office/word/2018/wordml/cex" xmlns:w16cid="http://schemas.microsoft.com/office/word/2016/wordml/cid" xmlns:w16="http://schemas.microsoft.com/office/word/2018/wordml" xmlns:w16du="http://schemas.microsoft.com/office/word/2023/wordml/word16du" xmlns:w16sdtdh="http://schemas.microsoft.com/office/word/2020/wordml/sdtdatahash" xmlns:w16sdtfl="http://schemas.microsoft.com/office/word/2024/wordml/sdtformatlock" xmlns:w16se="http://schemas.microsoft.com/office/word/2015/wordml/symex" xmlns:wpg="http://schemas.microsoft.com/office/word/2010/wordprocessingGroup" xmlns:wpi="http://schemas.microsoft.com/office/word/2010/wordprocessingInk" xmlns:wne="http://schemas.microsoft.com/office/word/2006/wordml" xmlns:wps="http://schemas.microsoft.com/office/word/2010/wordprocessingShape" mc:Ignorable="w14 w15 w16se w16cid w16 w16cex w16sdtdh w16sdtfl w16du wp14">
+<w:numbering xmlns:wpc="http://schemas.microsoft.com/office/word/2010/wordprocessingCanvas" xmlns:cx="http://schemas.microsoft.com/office/drawing/2014/chartex" xmlns:cx1="http://schemas.microsoft.com/office/drawing/2015/9/8/chartex" xmlns:cx2="http://schemas.microsoft.com/office/drawing/2015/10/21/chartex" xmlns:cx3="http://schemas.microsoft.com/office/drawing/2016/5/9/chartex" xmlns:cx4="http://schemas.microsoft.com/office/drawing/2016/5/10/chartex" xmlns:cx5="http://schemas.microsoft.com/office/drawing/2016/5/11/chartex" xmlns:cx6="http://schemas.microsoft.com/office/drawing/2016/5/12/chartex" xmlns:cx7="http://schemas.microsoft.com/office/drawing/2016/5/13/chartex" xmlns:cx8="http://schemas.microsoft.com/office/drawing/2016/5/14/chartex" xmlns:mc="http://schemas.openxmlformats.org/markup-compatibility/2006" xmlns:aink="http://schemas.microsoft.com/office/drawing/2016/ink" xmlns:am3d="http://schemas.microsoft.com/office/drawing/2017/model3d" xmlns:o="urn:schemas-microsoft-com:office:office" xmlns:oel="http://schemas.microsoft.com/office/2019/extlst" xmlns:r="http://schemas.openxmlformats.org/officeDocument/2006/relationships" xmlns:m="http://schemas.openxmlformats.org/officeDocument/2006/math" xmlns:v="urn:schemas-microsoft-com:vml" xmlns:wp14="http://schemas.microsoft.com/office/word/2010/wordprocessingDrawing" xmlns:wp="http://schemas.openxmlformats.org/drawingml/2006/wordprocessingDrawing" xmlns:w10="urn:schemas-microsoft-com:office:word" xmlns:w="http://schemas.openxmlformats.org/wordprocessingml/2006/main" xmlns:w14="http://schemas.microsoft.com/office/word/2010/wordml" xmlns:w15="http://schemas.microsoft.com/office/word/2012/wordml" xmlns:w16cex="http://schemas.microsoft.com/office/word/2018/wordml/cex" xmlns:w16cid="http://schemas.microsoft.com/office/word/2016/wordml/cid" xmlns:w16="http://schemas.microsoft.com/office/word/2018/wordml" xmlns:w16du="http://schemas.microsoft.com/office/word/2023/wordml/word16du" xmlns:w16sdtdh="http://schemas.microsoft.com/office/word/2020/wordml/sdtdatahash" xmlns:w16sdtfl="http://schemas.microsoft.com/office/word/2024/wordml/sdtformatlock" xmlns:w16se="http://schemas.microsoft.com/office/word/2015/wordml/symex" xmlns:wpg="http://schemas.microsoft.com/office/word/2010/wordprocessingGroup" xmlns:wpi="http://schemas.microsoft.com/office/word/2010/wordprocessingInk" xmlns:wne="http://schemas.microsoft.com/office/word/2006/wordml" xmlns:wps="http://schemas.microsoft.com/office/word/2010/wordprocessingShape" mc:Ignorable="w14 w15 w16se w16cid w16 w16cex w16sdtdh w16sdtfl w16du wp14">
   <w:abstractNum w:abstractNumId="0" w15:restartNumberingAfterBreak="0">
     <w:nsid w:val="05053F38"/>
     <w:multiLevelType w:val="hybridMultilevel"/>

</xml_diff>